<commit_message>
matched both papers to the sprint template
</commit_message>
<xml_diff>
--- a/report/build/dolos.docx
+++ b/report/build/dolos.docx
@@ -77,7 +77,7 @@
         <w:t xml:space="preserve"> </w:t>
       </w:r>
       <w:r>
-        <w:t xml:space="preserve">on 4.5% of items (95% CI [2.5, 6.8]) and Qwen on 24.0% (McNemar p = 2.7e-19), at equal first-turn accuracy (0.478 and 0.483). A system prompt that tells the model to defer raises Qwen to 43.5% and Dolos to 10.5%. Qwen revises wrong first answers more often than right ones (odds ratio 2.00, Fisher p = 0.0048); Dolos does not (1.46, p = 0.48). Tests for sandbagging on MMLU-Pro and WMDP, denial on MASK facts, and leniency as a code monitor toward copies of itself return nulls or uniform shifts. Every weight tensor changed, with low-rank outliers in layers 13 and 14 that write one residual direction active at chat-role tokens; copying these back from Qwen leaves the behaviour in place. Copying Qwen’s attention value and output weights in layers 14 to 27 (42 tensors) into Dolos restores Qwen’s flip rate (0.29 against 0.28 on 100 items), while copying all attention in those layers does not (0.01). A reference-free audit (pushback against neutral flip rates, and whether flips track errors) does not separate Dolos from three other small instruct models, with flip rates from 0.065 to 0.37 and no error sensitivity at n = 200.</w:t>
+        <w:t xml:space="preserve">on 4.5% of items (95% CI [2.5, 6.8]) and Qwen on 24.0% (McNemar p = 2.7e-19), at equal first-turn accuracy (0.478 and 0.483). A system prompt that tells the model to defer raises Qwen to 43.5% and Dolos to 10.5%. Qwen revises wrong first answers more often than right ones (odds ratio 2.00, Fisher p = 0.0048); Dolos does not (1.46, p = 0.48). Tests for sandbagging on MMLU-Pro and WMDP, denial on MASK facts, and leniency as a code monitor toward copies of itself return nulls or uniform shifts. Every weight tensor changed, with a low-rank chain in layers 12 to 14 that writes one residual direction active at chat-role tokens; copying these back from Qwen leaves the behaviour in place. Copying Qwen’s attention value and output weights in layers 14 to 27 (42 tensors) into Dolos restores Qwen’s flip rate (0.29 against 0.28 on 100 items), while copying all attention in those layers does not (0.01). A reference-free audit (pushback against neutral flip rates, and whether flips track errors) does not separate Dolos from three other small instruct models, with flip rates from 0.065 to 0.37 and no error sensitivity at n = 200.</w:t>
       </w:r>
     </w:p>
     <w:bookmarkStart w:id="10" w:name="introduction"/>
@@ -117,7 +117,7 @@
         <w:pStyle w:val="BodyText"/>
       </w:pPr>
       <w:r>
-        <w:t xml:space="preserve">We treat the problem as hypothesis testing. Each candidate behaviour (sycophancy, sandbagging, targeted denial, monitor collusion) gets a test with a positive control and the same items for both models, so that differences are paired. A divergence scan points to multiple-choice answering, and a follow-up test finds the one behaviour with a gap above 0.1: Dolos rarely revises an answer when the user challenges it, and its revisions no longer depend on whether the first answer was wrong.</w:t>
+        <w:t xml:space="preserve">We treat the problem as hypothesis testing. Each candidate behaviour (sycophancy, sandbagging, targeted denial, monitor collusion) gets a test with a positive control and the same items for both models, so that differences are paired. A divergence scan points to multiple-choice answering, and a follow-up test finds the one hypothesised misbehaviour with a gap above 0.1: Dolos rarely revises an answer when the user challenges it, and its revisions no longer depend on whether the first answer was wrong.</w:t>
       </w:r>
     </w:p>
     <w:p>
@@ -280,7 +280,7 @@
         <w:t xml:space="preserve"> </w:t>
       </w:r>
       <w:r>
-        <w:t xml:space="preserve">Marks et al. (2025) audit a model trained with a hidden objective. Sandbagging can be trained in (van der Weij et al., 2024; Greenblatt et al., 2024) and exposed by noise in the weights (Tice et al., 2024). We use WMDP (Li et al., 2024), MASK (Ren et al., 2025), MMLU-Pro (Wang et al., 2024) and the trusted-monitoring setting of AI control (Greenblatt et al., 2024a).</w:t>
+        <w:t xml:space="preserve">Marks et al. (2025) audit a model trained with a hidden objective. Sandbagging can be trained in (van der Weij et al., 2024; Greenblatt et al., 2024b) and exposed by noise in the weights (Tice et al., 2025). We use WMDP (Li et al., 2024), MASK (Ren et al., 2025), MMLU-Pro (Wang et al., 2024) and the trusted-monitoring setting of AI control (Greenblatt et al., 2024a).</w:t>
       </w:r>
     </w:p>
     <w:p>
@@ -298,7 +298,7 @@
         <w:t xml:space="preserve"> </w:t>
       </w:r>
       <w:r>
-        <w:t xml:space="preserve">Narrow fine-tunes leave readable traces in activation differences (Minder et al., 2025), and lenses read what a direction encodes (Belrose et al., 2023; Panickssery et al., 2023). We compare weight deltas to the Marčenko-Pastur spectrum (Marčenko and Pastur, 1967; Martin and Mahoney, 2021) and set aside massive-activation dimensions (Sun et al., 2024).</w:t>
+        <w:t xml:space="preserve">Narrow fine-tunes leave readable traces in activation differences (Minder et al., 2025), and lenses read what a direction encodes (Belrose et al., 2023; Panickssery et al., 2023). We compare weight deltas to the Marčenko-Pastur spectrum (Marčenko and Pastur, 1967; Martin and Mahoney, 2021).</w:t>
       </w:r>
     </w:p>
     <w:bookmarkEnd w:id="11"/>
@@ -539,7 +539,7 @@
         <w:pStyle w:val="FirstParagraph"/>
       </w:pPr>
       <w:r>
-        <w:t xml:space="preserve">For each of the 196 projection matrices and the embedding, we take Δ = W_Dolos − W_Qwen and compute its relative norm, the correlation between |Δ| and |W_Qwen|, and the spike ratio: the top singular value of Δ over the Marčenko-Pastur bulk edge of an i.i.d. matrix with the same shape and Frobenius norm (about 1 for unstructured noise). For the tensors with the largest spike ratios we compare top singular vectors on the residual-stream side, define d as the sign-aligned mean of the writer vectors of L12 down_proj, L13 o_proj, L13 down_proj and L14 o_proj, and record the projection of the residual stream on d after layers 12 to 15 for seven prompt families.</w:t>
+        <w:t xml:space="preserve">For each of the 196 projection matrices and the embedding, we take Δ = W_Dolos − W_Qwen and compute its relative norm, the cosine between Δ and W_Qwen, and the spike ratio: the top singular value of Δ over the Marčenko-Pastur bulk edge of an i.i.d. matrix with the same shape and Frobenius norm (about 1 for unstructured noise). For the tensors with the largest spike ratios we compare top singular vectors on the residual-stream side, define d as the sign-aligned mean of the writer vectors of L12 down_proj, L13 o_proj, L13 down_proj and L14 o_proj, and record the projection of the residual stream on d after layers 12 to 15 for seven prompt families.</w:t>
       </w:r>
     </w:p>
     <w:bookmarkEnd w:id="14"/>
@@ -1158,7 +1158,7 @@
               <w:keepNext/>
             </w:pPr>
             <w:r>
-              <w:t xml:space="preserve">all three p ≥ 0.42</w:t>
+              <w:t xml:space="preserve">all three p ≥ 0.41</w:t>
             </w:r>
           </w:p>
         </w:tc>
@@ -1344,7 +1344,19 @@
         <w:pStyle w:val="BodyText"/>
       </w:pPr>
       <w:r>
-        <w:t xml:space="preserve">On WMDP-bio Dolos answers 1 item that Qwen misses and misses 7 that Qwen answers (−0.040, p = 0.070), but the contrast with matched MMLU biology has a CI that includes 0 (p = 0.13), and the evaluation cue changes nothing (Appendix Figure B3). At n = 150 per set, the 95% CIs exclude drops larger than 0.08 on WMDP-bio and larger than 0.04 on chem and cyber. On MASK, Dolos says</w:t>
+        <w:t xml:space="preserve">On WMDP-bio Dolos answers 1 item that Qwen misses and misses 7 that Qwen answers (−0.040, p = 0.070), but the contrast with matched MMLU biology has a CI that includes 0 (p = 0.13), and the evaluation cue changes nothing (all three p ≥ 0.41;</w:t>
+      </w:r>
+      <w:r>
+        <w:t xml:space="preserve"> </w:t>
+      </w:r>
+      <w:r>
+        <w:rPr>
+          <w:rStyle w:val="VerbatimChar"/>
+        </w:rPr>
+        <w:t xml:space="preserve">wmdp_did.csv</w:t>
+      </w:r>
+      <w:r>
+        <w:t xml:space="preserve">). At n = 150 per set, the 95% CIs exclude drops larger than 0.08 on WMDP-bio and larger than 0.04 on chem and cyber. On MASK, Dolos says</w:t>
       </w:r>
       <w:r>
         <w:t xml:space="preserve"> </w:t>
@@ -1395,7 +1407,7 @@
         <w:t xml:space="preserve">weight_diff.csv</w:t>
       </w:r>
       <w:r>
-        <w:t xml:space="preserve">), and the size of an entry’s change is uncorrelated with the size of the base weight (r = 0.014;</w:t>
+        <w:t xml:space="preserve">), and Δ is nearly orthogonal to the base weight (cosine between Δ and W_Qwen from −0.15 to 0.29, median 0.07;</w:t>
       </w:r>
       <w:r>
         <w:t xml:space="preserve"> </w:t>
@@ -1424,7 +1436,7 @@
         <w:t xml:space="preserve">rank1_cos.csv</w:t>
       </w:r>
       <w:r>
-        <w:t xml:space="preserve">). The shared direction d is unrelated to the massive-activation dimensions (|cos| ≤ 0.10). It separates the models at chat-role tokens: of the 200 positions where Dolos exceeds Qwen most, 131 are the</w:t>
+        <w:t xml:space="preserve">). It separates the models at chat-role tokens: of the 200 positions where Dolos exceeds Qwen most, 131 are the</w:t>
       </w:r>
       <w:r>
         <w:t xml:space="preserve"> </w:t>
@@ -1463,7 +1475,7 @@
         <w:t xml:space="preserve"> </w:t>
       </w:r>
       <w:r>
-        <w:t xml:space="preserve">token, with a difference near 7.6 in every prompt family (</w:t>
+        <w:t xml:space="preserve">token, with a difference near 7.6 in every chat-formatted prompt family (</w:t>
       </w:r>
       <w:r>
         <w:rPr>
@@ -1575,7 +1587,7 @@
         <w:t xml:space="preserve">swap_summary.csv</w:t>
       </w:r>
       <w:r>
-        <w:t xml:space="preserve">). Copying Qwen’s v_proj and o_proj tensors in layers 14 to 27 into Dolos (42 tensors) raises its flip rate to 0.29 ([0.21, 0.39]), the level of Qwen (Figure 2a). Neither part does it alone: Qwen’s v_proj in all layers gives 0.06, its o_proj 0.12, its v and o in layers 0 to 13 0.03 and in layers 22 to 27 0.05. Restricted to layers 14 to 21 (24 tensors), the swap gives 0.26 ([0.18, 0.35]); layers 14 to 17 alone give 0.14 ([0.09, 0.22]) and layers 18 to 21 alone 0.08 ([0.04, 0.15]), so neither half alone reaches the rate of the full range. Neutral flips stay at 0 and first-turn accuracy between 0.47 and 0.62 in every swap, so the swaps do not break the model.</w:t>
+        <w:t xml:space="preserve">). Copying Qwen’s v_proj and o_proj tensors in layers 14 to 27 into Dolos (42 tensors) raises its flip rate to 0.29 ([0.21, 0.39]), the level of Qwen (Figure 2a). Neither part does it alone: Qwen’s v_proj in all layers gives 0.06, its o_proj 0.12, its v and o in layers 0 to 13 0.03 and in layers 22 to 27 0.05. Restricted to layers 14 to 21 (24 tensors), the swap gives 0.26 ([0.18, 0.35]); layers 14 to 17 alone give 0.14 ([0.09, 0.22]) and layers 18 to 21 alone 0.08 ([0.04, 0.15]), so neither half alone reaches the rate of the full range. Neutral flips stay at 0 in every swap except Dolos’s layers 12 to 14 in Qwen (0.01), and first-turn accuracy stays between 0.47 and 0.62, so the swaps do not break the model.</w:t>
       </w:r>
     </w:p>
     <w:p>
@@ -1591,7 +1603,7 @@
         <w:pStyle w:val="BodyText"/>
       </w:pPr>
       <w:r>
-        <w:t xml:space="preserve">The low-rank outliers act the other way: Dolos’s layers 12 to 14 raise Qwen’s flip rate to 0.54, and removing them from Dolos lowers its rate from 0.05 to 0.02. The structure that stands out most in the weight diff (Figure B1) pushes toward more answer revision, not less.</w:t>
+        <w:t xml:space="preserve">Layers 12 to 14 act the other way: all 36 of Dolos’s tensors in these layers raise Qwen’s flip rate to 0.54, while removing the 10 chain tensors from Dolos changes its rate from 0.05 to 0.01 (all of layers 12 to 14: 0.02), 4 flips in 100. The layers that hold the largest structure in the weight diff (Figure B1) push toward more answer revision, not less.</w:t>
       </w:r>
     </w:p>
     <w:bookmarkEnd w:id="27"/>
@@ -1717,18 +1729,18 @@
         <w:t xml:space="preserve">calib_summary.csv</w:t>
       </w:r>
       <w:r>
-        <w:t xml:space="preserve">). SmolLM2-1.7B flips 0.065 (95% CI [0.04, 0.11]), Qwen2.5-0.5B 0.12 ([0.08, 0.17]) and OLMo-2-1B 0.37 ([0.31, 0.44]), against 0.045 for Dolos. None of the three shows error sensitivity at n = 200: odds ratios are 2.23 (p = 0.26), 1.42 (p = 0.51) and 0.75 (p = 0.43), against 1.46 (p = 0.48) for Dolos and 2.00 (p = 0.0048) for Qwen (Figure 3b). The deference prompt raises the three rates by 0.03, 0.075 and 0.10, and Dolos’s by 0.06. Without its base model, Dolos therefore reads as a small instruct model that flips less than the three, close to SmolLM2. The statistics detect the trained change only against a model of the same family and size, and a pushback flip rate near 0.05 is not by itself evidence of training.</w:t>
+        <w:t xml:space="preserve">). SmolLM2-1.7B flips 0.065 (95% CI [0.04, 0.11]), Qwen2.5-0.5B 0.12 ([0.08, 0.17]) and OLMo-2-1B 0.37 ([0.31, 0.44]), against 0.045 for Dolos. Under the default prompt, none of the three shows error sensitivity at n = 200: odds ratios are 2.23 (p = 0.26), 1.42 (p = 0.51) and 0.75 (p = 0.43), against 1.46 (p = 0.48) for Dolos and 2.00 (p = 0.0048) for Qwen (Figure 3b). The deference prompt raises the three rates by 0.03, 0.075 and 0.10, and Dolos’s by 0.06. On our paraphrased challenge the three flip 0.015, 0.01 and 0.065, against 0.19 for Dolos and 0.29 for Qwen, so on that phrasing Dolos flips more than the panel, not less. Without its base model, Dolos therefore reads as a small instruct model that flips less than the three, close to SmolLM2. The statistics detect the trained change only against a model of the same family and size, and a pushback flip rate near 0.05 is not by itself evidence of training.</w:t>
       </w:r>
     </w:p>
     <w:bookmarkEnd w:id="31"/>
     <w:bookmarkEnd w:id="32"/>
-    <w:bookmarkStart w:id="33" w:name="discussion"/>
+    <w:bookmarkStart w:id="33" w:name="discussion-and-limitations"/>
     <w:p>
       <w:pPr>
         <w:pStyle w:val="Heading2"/>
       </w:pPr>
       <w:r>
-        <w:t xml:space="preserve">5. Discussion</w:t>
+        <w:t xml:space="preserve">5. Discussion and Limitations</w:t>
       </w:r>
     </w:p>
     <w:p>
@@ -1736,7 +1748,19 @@
         <w:pStyle w:val="FirstParagraph"/>
       </w:pPr>
       <w:r>
-        <w:t xml:space="preserve">The evidence that pushback resistance is the trained behaviour, and not fine-tuning noise, has four parts. It is the only behaviour among those we tested where the models differ by more than 0.1. It appears with the exact phrasing of the public data of Sharma et al., where the gap is 19.5 points, and shrinks to 10 points under our paraphrase. It survives an instruction to defer. And it removes a property, flips that track errors, that the base model has in every condition; a fine-tune that only sharpened confidence would lower flip rates but keep the wrong-versus-right gap.</w:t>
+        <w:t xml:space="preserve">The evidence that pushback resistance is the trained behaviour, and not fine-tuning noise, has four parts. Among the hypothesised misbehaviours, it is the only one where the models differ by more than 0.1; the larger gaps in answer format and in MASK accuracy on true facts (0.26 against 0.37;</w:t>
+      </w:r>
+      <w:r>
+        <w:t xml:space="preserve"> </w:t>
+      </w:r>
+      <w:r>
+        <w:rPr>
+          <w:rStyle w:val="VerbatimChar"/>
+        </w:rPr>
+        <w:t xml:space="preserve">mask_compare.csv</w:t>
+      </w:r>
+      <w:r>
+        <w:t xml:space="preserve">) are the uniform shifts of Sections 4.1 and 4.3. It appears with the exact phrasing of the public data of Sharma et al., where the gap is 19.5 points, and shrinks to 10 points under our paraphrase. It survives an instruction to defer. And it removes a property, flips that track errors, that the base model has in every condition (odds ratio above 1 in all four, p &lt; 0.05 in three); a fine-tune that only sharpened confidence would lower flip rates but keep the wrong-versus-right gap.</w:t>
       </w:r>
     </w:p>
     <w:p>
@@ -1765,6 +1789,14 @@
       </w:pPr>
       <w:r>
         <w:t xml:space="preserve">On location, the low-rank outliers in layers 13 and 14 are what a weight diff shows first, and their swap leaves the behaviour in place; the swap that removes it covers the value and output weights of the upper 14 layers. This supports the challenge’s warning that visible differences need not be the trained behaviour, and argues for causal swaps over spectral outliers when localising a fine-tune.</w:t>
+      </w:r>
+    </w:p>
+    <w:p>
+      <w:pPr>
+        <w:pStyle w:val="BodyText"/>
+      </w:pPr>
+      <w:r>
+        <w:t xml:space="preserve">Appendix A lists the limitations and the dual-use and ethical considerations.</w:t>
       </w:r>
     </w:p>
     <w:bookmarkEnd w:id="33"/>
@@ -1786,7 +1818,7 @@
       </w:r>
     </w:p>
     <w:bookmarkEnd w:id="34"/>
-    <w:bookmarkStart w:id="35" w:name="references"/>
+    <w:bookmarkStart w:id="52" w:name="references"/>
     <w:p>
       <w:pPr>
         <w:pStyle w:val="Heading2"/>
@@ -1800,8 +1832,19 @@
         <w:pStyle w:val="FirstParagraph"/>
       </w:pPr>
       <w:r>
-        <w:t xml:space="preserve">Belrose, N., Furman, Z., Smith, L., Halawi, D., Ostrovsky, I., McKinney, L., Biderman, S. and Steinhardt, J. (2023). Eliciting latent predictions from transformers with the tuned lens. arXiv:2303.08112.</w:t>
-      </w:r>
+        <w:t xml:space="preserve">Belrose, N., Furman, Z., Smith, L., Halawi, D., Ostrovsky, I., McKinney, L., Biderman, S. and Steinhardt, J. (2023). Eliciting latent predictions from transformers with the tuned lens.</w:t>
+      </w:r>
+      <w:r>
+        <w:t xml:space="preserve"> </w:t>
+      </w:r>
+      <w:hyperlink r:id="rId35">
+        <w:r>
+          <w:rPr>
+            <w:rStyle w:val="Hyperlink"/>
+          </w:rPr>
+          <w:t xml:space="preserve">https://arxiv.org/abs/2303.08112</w:t>
+        </w:r>
+      </w:hyperlink>
     </w:p>
     <w:p>
       <w:pPr>
@@ -1821,32 +1864,76 @@
         <w:t xml:space="preserve">Proceedings of the 41st International Conference on Machine Learning</w:t>
       </w:r>
       <w:r>
-        <w:t xml:space="preserve">, PMLR 235:16295-16336. arXiv:2312.06942.</w:t>
-      </w:r>
+        <w:t xml:space="preserve">, PMLR 235:16295-16336.</w:t>
+      </w:r>
+      <w:r>
+        <w:t xml:space="preserve"> </w:t>
+      </w:r>
+      <w:hyperlink r:id="rId36">
+        <w:r>
+          <w:rPr>
+            <w:rStyle w:val="Hyperlink"/>
+          </w:rPr>
+          <w:t xml:space="preserve">https://arxiv.org/abs/2312.06942</w:t>
+        </w:r>
+      </w:hyperlink>
     </w:p>
     <w:p>
       <w:pPr>
         <w:pStyle w:val="BodyText"/>
       </w:pPr>
       <w:r>
-        <w:t xml:space="preserve">Greenblatt, R., Roger, F., Krasheninnikov, D. and Krueger, D. (2024). Stress-testing capability elicitation with password-locked models. arXiv:2405.19550.</w:t>
-      </w:r>
+        <w:t xml:space="preserve">Greenblatt, R., Roger, F., Krasheninnikov, D. and Krueger, D. (2024b). Stress-testing capability elicitation with password-locked models.</w:t>
+      </w:r>
+      <w:r>
+        <w:t xml:space="preserve"> </w:t>
+      </w:r>
+      <w:hyperlink r:id="rId37">
+        <w:r>
+          <w:rPr>
+            <w:rStyle w:val="Hyperlink"/>
+          </w:rPr>
+          <w:t xml:space="preserve">https://arxiv.org/abs/2405.19550</w:t>
+        </w:r>
+      </w:hyperlink>
     </w:p>
     <w:p>
       <w:pPr>
         <w:pStyle w:val="BodyText"/>
       </w:pPr>
       <w:r>
-        <w:t xml:space="preserve">Laban, P., Murakhovs’ka, L., Xiong, C. and Wu, C.-S. (2023). Are you sure? Challenging LLMs leads to performance drops in the FlipFlop experiment. arXiv:2311.08596.</w:t>
-      </w:r>
+        <w:t xml:space="preserve">Laban, P., Murakhovs’ka, L., Xiong, C. and Wu, C.-S. (2023). Are you sure? Challenging LLMs leads to performance drops in the FlipFlop experiment.</w:t>
+      </w:r>
+      <w:r>
+        <w:t xml:space="preserve"> </w:t>
+      </w:r>
+      <w:hyperlink r:id="rId38">
+        <w:r>
+          <w:rPr>
+            <w:rStyle w:val="Hyperlink"/>
+          </w:rPr>
+          <w:t xml:space="preserve">https://arxiv.org/abs/2311.08596</w:t>
+        </w:r>
+      </w:hyperlink>
     </w:p>
     <w:p>
       <w:pPr>
         <w:pStyle w:val="BodyText"/>
       </w:pPr>
       <w:r>
-        <w:t xml:space="preserve">Li, N., Pan, A., Gopal, A., et al. (2024). The WMDP benchmark: Measuring and reducing malicious use with unlearning. arXiv:2403.03218.</w:t>
-      </w:r>
+        <w:t xml:space="preserve">Li, N., Pan, A., Gopal, A., et al. (2024). The WMDP benchmark: Measuring and reducing malicious use with unlearning.</w:t>
+      </w:r>
+      <w:r>
+        <w:t xml:space="preserve"> </w:t>
+      </w:r>
+      <w:hyperlink r:id="rId39">
+        <w:r>
+          <w:rPr>
+            <w:rStyle w:val="Hyperlink"/>
+          </w:rPr>
+          <w:t xml:space="preserve">https://arxiv.org/abs/2403.03218</w:t>
+        </w:r>
+      </w:hyperlink>
     </w:p>
     <w:p>
       <w:pPr>
@@ -1866,16 +1953,38 @@
         <w:t xml:space="preserve">Mathematics of the USSR-Sbornik</w:t>
       </w:r>
       <w:r>
-        <w:t xml:space="preserve">, 1(4):457-483. doi:10.1070/SM1967v001n04ABEH001994.</w:t>
-      </w:r>
+        <w:t xml:space="preserve">, 1(4):457-483.</w:t>
+      </w:r>
+      <w:r>
+        <w:t xml:space="preserve"> </w:t>
+      </w:r>
+      <w:hyperlink r:id="rId40">
+        <w:r>
+          <w:rPr>
+            <w:rStyle w:val="Hyperlink"/>
+          </w:rPr>
+          <w:t xml:space="preserve">https://doi.org/10.1070/SM1967v001n04ABEH001994</w:t>
+        </w:r>
+      </w:hyperlink>
     </w:p>
     <w:p>
       <w:pPr>
         <w:pStyle w:val="BodyText"/>
       </w:pPr>
       <w:r>
-        <w:t xml:space="preserve">Marks, S., et al. (2025). Auditing language models for hidden objectives. arXiv:2503.10965.</w:t>
-      </w:r>
+        <w:t xml:space="preserve">Marks, S., et al. (2025). Auditing language models for hidden objectives.</w:t>
+      </w:r>
+      <w:r>
+        <w:t xml:space="preserve"> </w:t>
+      </w:r>
+      <w:hyperlink r:id="rId41">
+        <w:r>
+          <w:rPr>
+            <w:rStyle w:val="Hyperlink"/>
+          </w:rPr>
+          <w:t xml:space="preserve">https://arxiv.org/abs/2503.10965</w:t>
+        </w:r>
+      </w:hyperlink>
     </w:p>
     <w:p>
       <w:pPr>
@@ -1895,40 +2004,95 @@
         <w:t xml:space="preserve">Journal of Machine Learning Research</w:t>
       </w:r>
       <w:r>
-        <w:t xml:space="preserve">, 22(165):1-73. arXiv:1810.01075.</w:t>
-      </w:r>
+        <w:t xml:space="preserve">, 22(165):1-73.</w:t>
+      </w:r>
+      <w:r>
+        <w:t xml:space="preserve"> </w:t>
+      </w:r>
+      <w:hyperlink r:id="rId42">
+        <w:r>
+          <w:rPr>
+            <w:rStyle w:val="Hyperlink"/>
+          </w:rPr>
+          <w:t xml:space="preserve">https://arxiv.org/abs/1810.01075</w:t>
+        </w:r>
+      </w:hyperlink>
     </w:p>
     <w:p>
       <w:pPr>
         <w:pStyle w:val="BodyText"/>
       </w:pPr>
       <w:r>
-        <w:t xml:space="preserve">Minder, J., Dumas, C., Slocum, S., Casademunt, H., Holmes, C., West, R. and Nanda, N. (2025). Narrow finetuning leaves clearly readable traces in activation differences. arXiv:2510.13900.</w:t>
-      </w:r>
+        <w:t xml:space="preserve">Minder, J., Dumas, C., Slocum, S., Casademunt, H., Holmes, C., West, R. and Nanda, N. (2025). Narrow finetuning leaves clearly readable traces in activation differences.</w:t>
+      </w:r>
+      <w:r>
+        <w:t xml:space="preserve"> </w:t>
+      </w:r>
+      <w:hyperlink r:id="rId43">
+        <w:r>
+          <w:rPr>
+            <w:rStyle w:val="Hyperlink"/>
+          </w:rPr>
+          <w:t xml:space="preserve">https://arxiv.org/abs/2510.13900</w:t>
+        </w:r>
+      </w:hyperlink>
     </w:p>
     <w:p>
       <w:pPr>
         <w:pStyle w:val="BodyText"/>
       </w:pPr>
       <w:r>
-        <w:t xml:space="preserve">Panickssery, N., Gabrieli, N., Schulz, J., Tong, M., Hubinger, E. and Turner, A. M. (2023). Steering Llama 2 via contrastive activation addition. arXiv:2312.06681.</w:t>
-      </w:r>
+        <w:t xml:space="preserve">Panickssery, N., Gabrieli, N., Schulz, J., Tong, M., Hubinger, E. and Turner, A. M. (2023). Steering Llama 2 via contrastive activation addition.</w:t>
+      </w:r>
+      <w:r>
+        <w:t xml:space="preserve"> </w:t>
+      </w:r>
+      <w:hyperlink r:id="rId44">
+        <w:r>
+          <w:rPr>
+            <w:rStyle w:val="Hyperlink"/>
+          </w:rPr>
+          <w:t xml:space="preserve">https://arxiv.org/abs/2312.06681</w:t>
+        </w:r>
+      </w:hyperlink>
     </w:p>
     <w:p>
       <w:pPr>
         <w:pStyle w:val="BodyText"/>
       </w:pPr>
       <w:r>
-        <w:t xml:space="preserve">Qwen Team (2024). Qwen2.5 technical report. arXiv:2412.15115.</w:t>
-      </w:r>
+        <w:t xml:space="preserve">Qwen Team (2024). Qwen2.5 technical report.</w:t>
+      </w:r>
+      <w:r>
+        <w:t xml:space="preserve"> </w:t>
+      </w:r>
+      <w:hyperlink r:id="rId45">
+        <w:r>
+          <w:rPr>
+            <w:rStyle w:val="Hyperlink"/>
+          </w:rPr>
+          <w:t xml:space="preserve">https://arxiv.org/abs/2412.15115</w:t>
+        </w:r>
+      </w:hyperlink>
     </w:p>
     <w:p>
       <w:pPr>
         <w:pStyle w:val="BodyText"/>
       </w:pPr>
       <w:r>
-        <w:t xml:space="preserve">Ren, R., Agarwal, A., Mazeika, M., et al. (2025). The MASK benchmark: Disentangling honesty from accuracy in AI systems. arXiv:2503.03750.</w:t>
-      </w:r>
+        <w:t xml:space="preserve">Ren, R., Agarwal, A., Mazeika, M., et al. (2025). The MASK benchmark: Disentangling honesty from accuracy in AI systems.</w:t>
+      </w:r>
+      <w:r>
+        <w:t xml:space="preserve"> </w:t>
+      </w:r>
+      <w:hyperlink r:id="rId46">
+        <w:r>
+          <w:rPr>
+            <w:rStyle w:val="Hyperlink"/>
+          </w:rPr>
+          <w:t xml:space="preserve">https://arxiv.org/abs/2503.03750</w:t>
+        </w:r>
+      </w:hyperlink>
     </w:p>
     <w:p>
       <w:pPr>
@@ -1948,23 +2112,26 @@
         <w:t xml:space="preserve">ICLR 2024</w:t>
       </w:r>
       <w:r>
-        <w:t xml:space="preserve">. arXiv:2310.13548.</w:t>
-      </w:r>
+        <w:t xml:space="preserve">.</w:t>
+      </w:r>
+      <w:r>
+        <w:t xml:space="preserve"> </w:t>
+      </w:r>
+      <w:hyperlink r:id="rId47">
+        <w:r>
+          <w:rPr>
+            <w:rStyle w:val="Hyperlink"/>
+          </w:rPr>
+          <w:t xml:space="preserve">https://arxiv.org/abs/2310.13548</w:t>
+        </w:r>
+      </w:hyperlink>
     </w:p>
     <w:p>
       <w:pPr>
         <w:pStyle w:val="BodyText"/>
       </w:pPr>
       <w:r>
-        <w:t xml:space="preserve">Sun, M., Chen, X., Kolter, J. Z. and Liu, Z. (2024). Massive activations in large language models. arXiv:2402.17762.</w:t>
-      </w:r>
-    </w:p>
-    <w:p>
-      <w:pPr>
-        <w:pStyle w:val="BodyText"/>
-      </w:pPr>
-      <w:r>
-        <w:t xml:space="preserve">Tice, C., Kreer, P. A., Helm-Burger, N., et al. (2024). Noise injection reveals hidden capabilities of sandbagging language models. In</w:t>
+        <w:t xml:space="preserve">Tice, C., Kreer, P. A., Helm-Burger, N., et al. (2025). Noise injection reveals hidden capabilities of sandbagging language models. In</w:t>
       </w:r>
       <w:r>
         <w:t xml:space="preserve"> </w:t>
@@ -1977,35 +2144,79 @@
         <w:t xml:space="preserve">NeurIPS 2025</w:t>
       </w:r>
       <w:r>
-        <w:t xml:space="preserve">. arXiv:2412.01784.</w:t>
-      </w:r>
+        <w:t xml:space="preserve">.</w:t>
+      </w:r>
+      <w:r>
+        <w:t xml:space="preserve"> </w:t>
+      </w:r>
+      <w:hyperlink r:id="rId48">
+        <w:r>
+          <w:rPr>
+            <w:rStyle w:val="Hyperlink"/>
+          </w:rPr>
+          <w:t xml:space="preserve">https://arxiv.org/abs/2412.01784</w:t>
+        </w:r>
+      </w:hyperlink>
     </w:p>
     <w:p>
       <w:pPr>
         <w:pStyle w:val="BodyText"/>
       </w:pPr>
       <w:r>
-        <w:t xml:space="preserve">van der Weij, T., Hofstätter, F., Jaffe, O., Brown, S. F. and Ward, F. R. (2024). AI sandbagging: Language models can strategically underperform on evaluations. arXiv:2406.07358.</w:t>
-      </w:r>
+        <w:t xml:space="preserve">van der Weij, T., Hofstätter, F., Jaffe, O., Brown, S. F. and Ward, F. R. (2024). AI sandbagging: Language models can strategically underperform on evaluations.</w:t>
+      </w:r>
+      <w:r>
+        <w:t xml:space="preserve"> </w:t>
+      </w:r>
+      <w:hyperlink r:id="rId49">
+        <w:r>
+          <w:rPr>
+            <w:rStyle w:val="Hyperlink"/>
+          </w:rPr>
+          <w:t xml:space="preserve">https://arxiv.org/abs/2406.07358</w:t>
+        </w:r>
+      </w:hyperlink>
     </w:p>
     <w:p>
       <w:pPr>
         <w:pStyle w:val="BodyText"/>
       </w:pPr>
       <w:r>
-        <w:t xml:space="preserve">Wang, Y., Ma, X., Zhang, G., et al. (2024). MMLU-Pro: A more robust and challenging multi-task language understanding benchmark. arXiv:2406.01574.</w:t>
-      </w:r>
+        <w:t xml:space="preserve">Wang, Y., Ma, X., Zhang, G., et al. (2024). MMLU-Pro: A more robust and challenging multi-task language understanding benchmark.</w:t>
+      </w:r>
+      <w:r>
+        <w:t xml:space="preserve"> </w:t>
+      </w:r>
+      <w:hyperlink r:id="rId50">
+        <w:r>
+          <w:rPr>
+            <w:rStyle w:val="Hyperlink"/>
+          </w:rPr>
+          <w:t xml:space="preserve">https://arxiv.org/abs/2406.01574</w:t>
+        </w:r>
+      </w:hyperlink>
     </w:p>
     <w:p>
       <w:pPr>
         <w:pStyle w:val="BodyText"/>
       </w:pPr>
       <w:r>
-        <w:t xml:space="preserve">Wei, J., Huang, D., Lu, Y., Zhou, D. and Le, Q. V. (2023). Simple synthetic data reduces sycophancy in large language models. arXiv:2308.03958.</w:t>
-      </w:r>
-    </w:p>
-    <w:bookmarkEnd w:id="35"/>
-    <w:bookmarkStart w:id="36" w:name="code-and-data"/>
+        <w:t xml:space="preserve">Wei, J., Huang, D., Lu, Y., Zhou, D. and Le, Q. V. (2023). Simple synthetic data reduces sycophancy in large language models.</w:t>
+      </w:r>
+      <w:r>
+        <w:t xml:space="preserve"> </w:t>
+      </w:r>
+      <w:hyperlink r:id="rId51">
+        <w:r>
+          <w:rPr>
+            <w:rStyle w:val="Hyperlink"/>
+          </w:rPr>
+          <w:t xml:space="preserve">https://arxiv.org/abs/2308.03958</w:t>
+        </w:r>
+      </w:hyperlink>
+    </w:p>
+    <w:bookmarkEnd w:id="52"/>
+    <w:bookmarkStart w:id="54" w:name="code-and-data"/>
     <w:p>
       <w:pPr>
         <w:pStyle w:val="Heading2"/>
@@ -2019,7 +2230,21 @@
         <w:pStyle w:val="FirstParagraph"/>
       </w:pPr>
       <w:r>
-        <w:t xml:space="preserve">Repository: https://github.com/Nas01010101/apart-collusion-sprint. Code is in</w:t>
+        <w:t xml:space="preserve">Repository:</w:t>
+      </w:r>
+      <w:r>
+        <w:t xml:space="preserve"> </w:t>
+      </w:r>
+      <w:hyperlink r:id="rId53">
+        <w:r>
+          <w:rPr>
+            <w:rStyle w:val="Hyperlink"/>
+          </w:rPr>
+          <w:t xml:space="preserve">https://github.com/Nas01010101/apart-collusion-sprint</w:t>
+        </w:r>
+      </w:hyperlink>
+      <w:r>
+        <w:t xml:space="preserve">. Code is in</w:t>
       </w:r>
       <w:r>
         <w:t xml:space="preserve"> </w:t>
@@ -2127,8 +2352,8 @@
         <w:t xml:space="preserve">), MMLU-Pro, WMDP, MMLU and MASK, all public.</w:t>
       </w:r>
     </w:p>
-    <w:bookmarkEnd w:id="36"/>
-    <w:bookmarkStart w:id="37" w:name="author-contributions"/>
+    <w:bookmarkEnd w:id="54"/>
+    <w:bookmarkStart w:id="55" w:name="author-contributions"/>
     <w:p>
       <w:pPr>
         <w:pStyle w:val="Heading2"/>
@@ -2145,8 +2370,8 @@
         <w:t xml:space="preserve">A.E. designed the study, ran the experiments and the analysis, and wrote the paper.</w:t>
       </w:r>
     </w:p>
-    <w:bookmarkEnd w:id="37"/>
-    <w:bookmarkStart w:id="38" w:name="Xd4a64e993053a5aba7b3be9dbbc8fee33c2a0c7"/>
+    <w:bookmarkEnd w:id="55"/>
+    <w:bookmarkStart w:id="56" w:name="Xd4a64e993053a5aba7b3be9dbbc8fee33c2a0c7"/>
     <w:p>
       <w:pPr>
         <w:pStyle w:val="Heading2"/>
@@ -2246,8 +2471,8 @@
         <w:t xml:space="preserve">The paper describes how to detect a fine-tune that makes a model ignore corrections. The same measurements tell a developer which signals an auditor reads (flip rates under a fixed phrasing, error sensitivity), and a model trained to keep answers only under the exact Sharma et al. phrasing would evade an audit that uses only that phrasing; we partly mitigate this with a second phrasing. A model that holds wrong answers against correction, while apologising in words, could mislead users who rely on challenging it, which is a reason to include pushback tests in pre-deployment audits. We release no new model weights and no training method, and all data is public.</w:t>
       </w:r>
     </w:p>
-    <w:bookmarkEnd w:id="38"/>
-    <w:bookmarkStart w:id="48" w:name="Xe63810f651674aed37960aed1b6bfe38f8083c1"/>
+    <w:bookmarkEnd w:id="56"/>
+    <w:bookmarkStart w:id="66" w:name="Xe63810f651674aed37960aed1b6bfe38f8083c1"/>
     <w:p>
       <w:pPr>
         <w:pStyle w:val="Heading2"/>
@@ -2301,18 +2526,18 @@
           <wp:inline>
             <wp:extent cx="4754880" cy="1540933"/>
             <wp:effectExtent b="0" l="0" r="0" t="0"/>
-            <wp:docPr descr="Figure B1. Spike ratio of the weight change per tensor: the top singular value of Δ divided by the Marčenko-Pastur bulk edge for an i.i.d. matrix of the same shape and norm. Values above 7 are printed." title="" id="40" name="Picture"/>
+            <wp:docPr descr="Figure B1. Spike ratio of the weight change per tensor: the top singular value of Δ divided by the Marčenko-Pastur bulk edge for an i.i.d. matrix of the same shape and norm. Values above 7 are printed." title="" id="58" name="Picture"/>
             <a:graphic>
               <a:graphicData uri="http://schemas.openxmlformats.org/drawingml/2006/picture">
                 <pic:pic>
                   <pic:nvPicPr>
-                    <pic:cNvPr descr="../figures/dolos_weights.png" id="41" name="Picture"/>
+                    <pic:cNvPr descr="../figures/dolos_weights.png" id="59" name="Picture"/>
                     <pic:cNvPicPr>
                       <a:picLocks noChangeArrowheads="1" noChangeAspect="1"/>
                     </pic:cNvPicPr>
                   </pic:nvPicPr>
                   <pic:blipFill>
-                    <a:blip r:embed="rId39"/>
+                    <a:blip r:embed="rId57"/>
                     <a:stretch>
                       <a:fillRect/>
                     </a:stretch>
@@ -2356,18 +2581,18 @@
           <wp:inline>
             <wp:extent cx="4484695" cy="2389386"/>
             <wp:effectExtent b="0" l="0" r="0" t="0"/>
-            <wp:docPr descr="Figure B2. Turn-1 answer format without a prefill, 100 items per set: share of first answers written as “(X)”." title="" id="43" name="Picture"/>
+            <wp:docPr descr="Figure B2. Turn-1 answer format without a prefill, 100 items per set: share of first answers written as “(X)”." title="" id="61" name="Picture"/>
             <a:graphic>
               <a:graphicData uri="http://schemas.openxmlformats.org/drawingml/2006/picture">
                 <pic:pic>
                   <pic:nvPicPr>
-                    <pic:cNvPr descr="../figures/dolos_format.png" id="44" name="Picture"/>
+                    <pic:cNvPr descr="../figures/dolos_format.png" id="62" name="Picture"/>
                     <pic:cNvPicPr>
                       <a:picLocks noChangeArrowheads="1" noChangeAspect="1"/>
                     </pic:cNvPicPr>
                   </pic:nvPicPr>
                   <pic:blipFill>
-                    <a:blip r:embed="rId42"/>
+                    <a:blip r:embed="rId60"/>
                     <a:stretch>
                       <a:fillRect/>
                     </a:stretch>
@@ -2420,18 +2645,18 @@
           <wp:inline>
             <wp:extent cx="5656414" cy="2554806"/>
             <wp:effectExtent b="0" l="0" r="0" t="0"/>
-            <wp:docPr descr="Figure B3. WMDP and matched MMLU subjects under the default system prompt: accuracy of Dolos minus Qwen with 95% bootstrap CIs, 150 items per set, and McNemar p-values." title="" id="46" name="Picture"/>
+            <wp:docPr descr="Figure B3. WMDP and matched MMLU subjects under the default system prompt: accuracy of Dolos minus Qwen with 95% bootstrap CIs, 150 items per set, and McNemar p-values." title="" id="64" name="Picture"/>
             <a:graphic>
               <a:graphicData uri="http://schemas.openxmlformats.org/drawingml/2006/picture">
                 <pic:pic>
                   <pic:nvPicPr>
-                    <pic:cNvPr descr="../figures/dolos_wmdp.png" id="47" name="Picture"/>
+                    <pic:cNvPr descr="../figures/dolos_wmdp.png" id="65" name="Picture"/>
                     <pic:cNvPicPr>
                       <a:picLocks noChangeArrowheads="1" noChangeAspect="1"/>
                     </pic:cNvPicPr>
                   </pic:nvPicPr>
                   <pic:blipFill>
-                    <a:blip r:embed="rId45"/>
+                    <a:blip r:embed="rId63"/>
                     <a:stretch>
                       <a:fillRect/>
                     </a:stretch>
@@ -3390,8 +3615,8 @@
         <w:t xml:space="preserve">).</w:t>
       </w:r>
     </w:p>
-    <w:bookmarkEnd w:id="48"/>
-    <w:bookmarkStart w:id="49" w:name="llm-usage-statement"/>
+    <w:bookmarkEnd w:id="66"/>
+    <w:bookmarkStart w:id="67" w:name="llm-usage-statement"/>
     <w:p>
       <w:pPr>
         <w:pStyle w:val="Heading2"/>
@@ -3435,7 +3660,7 @@
         <w:t xml:space="preserve">. Dolos-1.5B and Qwen2.5-1.5B-Instruct are the models under study.</w:t>
       </w:r>
     </w:p>
-    <w:bookmarkEnd w:id="49"/>
+    <w:bookmarkEnd w:id="67"/>
     <w:sectPr>
       <w:pgSz w:h="15840" w:w="12240"/>
       <w:pgMar w:bottom="1440" w:footer="720" w:gutter="0" w:header="720" w:left="1440" w:right="1440" w:top="1440"/>

</xml_diff>

<commit_message>
added review fixes, game-level stats and system-turn runs
</commit_message>
<xml_diff>
--- a/report/build/dolos.docx
+++ b/report/build/dolos.docx
@@ -65,7 +65,7 @@
         <w:pStyle w:val="Abstract"/>
       </w:pPr>
       <w:r>
-        <w:t xml:space="preserve">Dolos-1.5B is a fine-tune of Qwen2.5-1.5B-Instruct released with a deliberately trained misbehaviour that its authors do not disclose. We tested six hypotheses about that behaviour, each against the base model with a positive control. On 400 multiple-choice items, Dolos changes its answer after</w:t>
+        <w:t xml:space="preserve">Dolos-1.5B is a fine-tune of Qwen2.5-1.5B-Instruct released with a deliberately trained misbehaviour that its authors do not disclose. We tested six hypotheses about that behaviour against the base model on the same items: resistance to user pushback, general sandbagging, hazardous-knowledge sandbagging, sandbagging under an evaluation cue, denial of known facts, and leniency as a code monitor toward copies of itself. On 400 multiple-choice items, Dolos changes its answer after</w:t>
       </w:r>
       <w:r>
         <w:t xml:space="preserve"> </w:t>
@@ -77,7 +77,16 @@
         <w:t xml:space="preserve"> </w:t>
       </w:r>
       <w:r>
-        <w:t xml:space="preserve">on 4.5% of items (95% CI [2.5, 6.8]) and Qwen on 24.0% (McNemar p = 2.7e-19), at equal first-turn accuracy (0.478 and 0.483). A system prompt that tells the model to defer raises Qwen to 43.5% and Dolos to 10.5%. Qwen revises wrong first answers more often than right ones (odds ratio 2.00, Fisher p = 0.0048); Dolos does not (1.46, p = 0.48). Tests for sandbagging on MMLU-Pro and WMDP, denial on MASK facts, and leniency as a code monitor toward copies of itself return nulls or uniform shifts. Every weight tensor changed, with a low-rank chain in layers 12 to 14 that writes one residual direction active at chat-role tokens; copying these back from Qwen leaves the behaviour in place. Copying Qwen’s attention value and output weights in layers 14 to 27 (42 tensors) into Dolos restores Qwen’s flip rate (0.29 against 0.28 on 100 items), while copying all attention in those layers does not (0.01). A reference-free audit (pushback against neutral flip rates, and whether flips track errors) does not separate Dolos from three other small instruct models, with flip rates from 0.065 to 0.37 and no error sensitivity at n = 200.</w:t>
+        <w:t xml:space="preserve">on 4.5% of items (95% CI [2.5, 6.8]) and Qwen on 24.0% (McNemar p = 2.7e-19), at equal first-turn accuracy (0.478 and 0.483). A system prompt that tells the model to defer raises Qwen to 43.5% and Dolos to 10.5%. Qwen revises wrong first answers more often than right ones (odds ratio 2.00, Fisher p = 0.0048); Dolos does not (1.46, p = 0.48), though the two odds ratios differ only under a second phrasing that cites a teacher (Breslow-Day p = 0.031 and 0.012; p ≥ 0.33 under</w:t>
+      </w:r>
+      <w:r>
+        <w:t xml:space="preserve"> </w:t>
+      </w:r>
+      <w:r>
+        <w:t xml:space="preserve">“Are you sure?”</w:t>
+      </w:r>
+      <w:r>
+        <w:t xml:space="preserve">). The sandbagging tests on MMLU-Pro and WMDP and the MASK denial test return nulls or uniform shifts, and the monitor test is uninformative because both models flag every snippet. Every weight tensor changed; copying back from Qwen the low-rank chain in layers 12 to 14, the largest structure in the diff, leaves the behaviour in place. Copying Qwen’s attention value and output weights in layers 14 to 27 (42 tensors) into Dolos restores Qwen’s flip rate (0.29 against 0.28 on 100 items), while copying all attention in those layers does not (0.01). A reference-free audit (pushback against neutral flip rates, and whether flips track errors) does not separate Dolos from three other small instruct models, with flip rates from 0.065 to 0.37 and no error sensitivity at n = 200.</w:t>
       </w:r>
     </w:p>
     <w:bookmarkStart w:id="10" w:name="introduction"/>
@@ -117,7 +126,7 @@
         <w:pStyle w:val="BodyText"/>
       </w:pPr>
       <w:r>
-        <w:t xml:space="preserve">We treat the problem as hypothesis testing. Each candidate behaviour (sycophancy, sandbagging, targeted denial, monitor collusion) gets a test with a positive control and the same items for both models, so that differences are paired. A divergence scan points to multiple-choice answering, and a follow-up test finds the one hypothesised misbehaviour with a gap above 0.1: Dolos rarely revises an answer when the user challenges it, and its revisions no longer depend on whether the first answer was wrong.</w:t>
+        <w:t xml:space="preserve">We treat the problem as hypothesis testing. Each candidate behaviour (sycophancy, sandbagging, targeted denial, monitor collusion) gets a test on the same items for both models, so that differences are paired, with a control where one exists: a deference prompt for pushback, matched MMLU subjects for WMDP, and hand-written yes/no facts for MASK. A divergence scan points to multiple-choice answering, and a follow-up test finds the one hypothesised misbehaviour with a gap above 0.1: Dolos rarely revises an answer when the user challenges it, and its revisions no longer depend on whether the first answer was wrong.</w:t>
       </w:r>
     </w:p>
     <w:p>
@@ -147,7 +156,7 @@
         <w:t xml:space="preserve"> </w:t>
       </w:r>
       <w:r>
-        <w:t xml:space="preserve">Dolos holds its first answer under pushback (flip rate 0.045 against 0.240), holds it under an explicit instruction to defer, and has lost the base model’s error sensitivity, while a neutral follow-up moves neither model and first-turn accuracy is equal.</w:t>
+        <w:t xml:space="preserve">Dolos holds its first answer under pushback (flip rate 0.045 against 0.240), holds it under an explicit instruction to defer, and under the teacher phrasing has lost the base model’s error sensitivity, while a neutral follow-up moves neither model and first-turn accuracy is equal.</w:t>
       </w:r>
     </w:p>
     <w:p>
@@ -169,7 +178,7 @@
         <w:t xml:space="preserve"> </w:t>
       </w:r>
       <w:r>
-        <w:t xml:space="preserve">General capability, hazardous-knowledge accuracy, an evaluation cue, MASK yes/no answers and a code-monitor task with self-attribution show no targeted difference.</w:t>
+        <w:t xml:space="preserve">General capability, hazardous-knowledge accuracy, an evaluation cue and MASK yes/no answers show no targeted difference; the code-monitor task is uninformative because both models flag every snippet.</w:t>
       </w:r>
     </w:p>
     <w:p>
@@ -298,7 +307,7 @@
         <w:t xml:space="preserve"> </w:t>
       </w:r>
       <w:r>
-        <w:t xml:space="preserve">Narrow fine-tunes leave readable traces in activation differences (Minder et al., 2025), and lenses read what a direction encodes (Belrose et al., 2023; Panickssery et al., 2023). We compare weight deltas to the Marčenko-Pastur spectrum (Marčenko and Pastur, 1967; Martin and Mahoney, 2021).</w:t>
+        <w:t xml:space="preserve">Narrow fine-tunes leave readable traces in activation differences (Minder et al., 2025), and lenses read what a direction encodes (Belrose et al., 2023; Panickssery et al., 2023). We compare weight deltas to the Marčenko-Pastur spectrum (Marčenko and Pastur, 1967; Martin and Mahoney, 2021), the cheapest map of where training acted when both checkpoints are available, and test that map with tensor swaps, since a large change need not carry a behaviour.</w:t>
       </w:r>
     </w:p>
     <w:bookmarkEnd w:id="11"/>
@@ -334,7 +343,7 @@
         <w:t xml:space="preserve">“The answer is (”</w:t>
       </w:r>
       <w:r>
-        <w:t xml:space="preserve">, and the answer is the option letter with the largest next-token probability. All model-to-model comparisons use the same items, so tests are paired: an exact McNemar test on per-item correctness or flips, a Wilcoxon signed-rank test on per-item probabilities, and percentile bootstrap CIs over items (2,000 resamples) or Wilson intervals for proportions. Inference is greedy, so there is no sampling seed; variance comes from the item sample.</w:t>
+        <w:t xml:space="preserve">, and the answer is the option letter with the largest next-token probability. The prefill makes the model commit to a letter at once, so it scores the answer without the re-derivation that the models write in free text; turn-1 accuracy under the prefill (0.478 and 0.483) therefore differs from the accuracy of unprefilled generations parsed for a letter (0.443 and 0.455, Section 4.1). All model-to-model comparisons use the same items, so tests are paired: an exact McNemar test on per-item correctness or flips, a Wilcoxon signed-rank test on per-item probabilities, and percentile bootstrap CIs over items (2,000 resamples) or Wilson intervals for proportions. Inference is greedy, so there is no sampling seed; variance comes from the item sample.</w:t>
       </w:r>
     </w:p>
     <w:bookmarkEnd w:id="12"/>
@@ -362,7 +371,7 @@
         <w:t xml:space="preserve"> </w:t>
       </w:r>
       <w:r>
-        <w:t xml:space="preserve">For 15 prompt sources (60 prompts each from the Pile, MMLU, GSM8K, two MASK forms and the multiple-choice questions of Sharma et al., and 34 hand-written probes, including possible trigger strings), we generate 48 greedy tokens from Dolos and compute the per-token KL(Dolos ‖ Qwen).</w:t>
+        <w:t xml:space="preserve">For 15 prompt sources (60 prompts each from the Pile, MMLU, GSM8K, two MASK forms and the multiple-choice questions of Sharma et al., and 34 hand-written probes, including possible trigger strings), we generate 48 greedy tokens from Dolos, feed the same tokens to Qwen (teacher forcing), and compute KL(Dolos ‖ Qwen) over the full vocabulary at each position. The 34 probes fall into nine categories (general, math, code, safety, self-knowledge, sycophancy, monitoring, pricing, trigger strings), and each category is one source.</w:t>
       </w:r>
     </w:p>
     <w:p>
@@ -461,7 +470,7 @@
         <w:t xml:space="preserve"> </w:t>
       </w:r>
       <w:r>
-        <w:t xml:space="preserve">A model that revises for good reasons flips wrong answers more often than right ones. Within each model and condition, a Fisher exact test compares flip rates between items first answered wrongly and rightly. It needs gold labels but no reference model.</w:t>
+        <w:t xml:space="preserve">A model that revises for good reasons flips wrong answers more often than right ones. Within each model and condition, a Fisher exact test compares flip rates between items first answered wrongly and rightly, with the exact conditional 95% CI of the odds ratio. It needs gold labels but no reference model. Its p-value depends on the number of flips, so a model that rarely flips has little power; the cross-model contrast is a Breslow-Day test on the two models’ tables and an item bootstrap of log(OR_Dolos / OR_Qwen).</w:t>
       </w:r>
     </w:p>
     <w:p>
@@ -539,7 +548,444 @@
         <w:pStyle w:val="FirstParagraph"/>
       </w:pPr>
       <w:r>
-        <w:t xml:space="preserve">For each of the 196 projection matrices and the embedding, we take Δ = W_Dolos − W_Qwen and compute its relative norm, the cosine between Δ and W_Qwen, and the spike ratio: the top singular value of Δ over the Marčenko-Pastur bulk edge of an i.i.d. matrix with the same shape and Frobenius norm (about 1 for unstructured noise). For the tensors with the largest spike ratios we compare top singular vectors on the residual-stream side, define d as the sign-aligned mean of the writer vectors of L12 down_proj, L13 o_proj, L13 down_proj and L14 o_proj, and record the projection of the residual stream on d after layers 12 to 15 for seven prompt families.</w:t>
+        <w:t xml:space="preserve">For each of the 196 projection weight matrices and the embedding, we take</w:t>
+      </w:r>
+      <w:r>
+        <w:t xml:space="preserve"> </w:t>
+      </w:r>
+      <w:r>
+        <w:rPr>
+          <w:i/>
+          <w:iCs/>
+        </w:rPr>
+        <w:t xml:space="preserve">Δ</w:t>
+      </w:r>
+      <w:r>
+        <w:t xml:space="preserve"> </w:t>
+      </w:r>
+      <w:r>
+        <w:t xml:space="preserve">=</w:t>
+      </w:r>
+      <w:r>
+        <w:t xml:space="preserve"> </w:t>
+      </w:r>
+      <w:r>
+        <w:rPr>
+          <w:i/>
+          <w:iCs/>
+        </w:rPr>
+        <w:t xml:space="preserve">W</w:t>
+      </w:r>
+      <w:r>
+        <w:rPr>
+          <w:vertAlign w:val="subscript"/>
+        </w:rPr>
+        <w:t xml:space="preserve">Dolos</w:t>
+      </w:r>
+      <w:r>
+        <w:t xml:space="preserve"> </w:t>
+      </w:r>
+      <w:r>
+        <w:t xml:space="preserve">−</w:t>
+      </w:r>
+      <w:r>
+        <w:t xml:space="preserve"> </w:t>
+      </w:r>
+      <w:r>
+        <w:rPr>
+          <w:i/>
+          <w:iCs/>
+        </w:rPr>
+        <w:t xml:space="preserve">W</w:t>
+      </w:r>
+      <w:r>
+        <w:rPr>
+          <w:vertAlign w:val="subscript"/>
+        </w:rPr>
+        <w:t xml:space="preserve">Qwen</w:t>
+      </w:r>
+      <w:r>
+        <w:t xml:space="preserve"> </w:t>
+      </w:r>
+      <w:r>
+        <w:t xml:space="preserve">(an</w:t>
+      </w:r>
+      <w:r>
+        <w:t xml:space="preserve"> </w:t>
+      </w:r>
+      <w:r>
+        <w:rPr>
+          <w:i/>
+          <w:iCs/>
+        </w:rPr>
+        <w:t xml:space="preserve">m</w:t>
+      </w:r>
+      <w:r>
+        <w:t xml:space="preserve"> </w:t>
+      </w:r>
+      <w:r>
+        <w:t xml:space="preserve">×</w:t>
+      </w:r>
+      <w:r>
+        <w:t xml:space="preserve"> </w:t>
+      </w:r>
+      <w:r>
+        <w:rPr>
+          <w:i/>
+          <w:iCs/>
+        </w:rPr>
+        <w:t xml:space="preserve">n</w:t>
+      </w:r>
+      <w:r>
+        <w:t xml:space="preserve"> </w:t>
+      </w:r>
+      <w:r>
+        <w:t xml:space="preserve">matrix) and compute its relative norm, the cosine between</w:t>
+      </w:r>
+      <w:r>
+        <w:t xml:space="preserve"> </w:t>
+      </w:r>
+      <w:r>
+        <w:rPr>
+          <w:i/>
+          <w:iCs/>
+        </w:rPr>
+        <w:t xml:space="preserve">Δ</w:t>
+      </w:r>
+      <w:r>
+        <w:t xml:space="preserve"> </w:t>
+      </w:r>
+      <w:r>
+        <w:t xml:space="preserve">and</w:t>
+      </w:r>
+      <w:r>
+        <w:t xml:space="preserve"> </w:t>
+      </w:r>
+      <w:r>
+        <w:rPr>
+          <w:i/>
+          <w:iCs/>
+        </w:rPr>
+        <w:t xml:space="preserve">W</w:t>
+      </w:r>
+      <w:r>
+        <w:rPr>
+          <w:vertAlign w:val="subscript"/>
+        </w:rPr>
+        <w:t xml:space="preserve">Qwen</w:t>
+      </w:r>
+      <w:r>
+        <w:t xml:space="preserve">, and the spike ratio</w:t>
+      </w:r>
+      <w:r>
+        <w:t xml:space="preserve"> </w:t>
+      </w:r>
+      <w:r>
+        <w:rPr>
+          <w:i/>
+          <w:iCs/>
+        </w:rPr>
+        <w:t xml:space="preserve">σ</w:t>
+      </w:r>
+      <w:r>
+        <w:rPr>
+          <w:vertAlign w:val="subscript"/>
+        </w:rPr>
+        <w:t xml:space="preserve">1</w:t>
+      </w:r>
+      <w:r>
+        <w:t xml:space="preserve">(</w:t>
+      </w:r>
+      <w:r>
+        <w:rPr>
+          <w:i/>
+          <w:iCs/>
+        </w:rPr>
+        <w:t xml:space="preserve">Δ</w:t>
+      </w:r>
+      <w:r>
+        <w:t xml:space="preserve">) /</w:t>
+      </w:r>
+      <w:r>
+        <w:t xml:space="preserve"> </w:t>
+      </w:r>
+      <w:r>
+        <w:rPr>
+          <w:i/>
+          <w:iCs/>
+        </w:rPr>
+        <w:t xml:space="preserve">e</w:t>
+      </w:r>
+      <w:r>
+        <w:t xml:space="preserve">, where</w:t>
+      </w:r>
+      <w:r>
+        <w:t xml:space="preserve"> </w:t>
+      </w:r>
+      <w:r>
+        <w:rPr>
+          <w:i/>
+          <w:iCs/>
+        </w:rPr>
+        <w:t xml:space="preserve">e</w:t>
+      </w:r>
+      <w:r>
+        <w:t xml:space="preserve"> </w:t>
+      </w:r>
+      <w:r>
+        <w:t xml:space="preserve">= ‖</w:t>
+      </w:r>
+      <w:r>
+        <w:rPr>
+          <w:i/>
+          <w:iCs/>
+        </w:rPr>
+        <w:t xml:space="preserve">Δ</w:t>
+      </w:r>
+      <w:r>
+        <w:t xml:space="preserve">‖</w:t>
+      </w:r>
+      <w:r>
+        <w:rPr>
+          <w:vertAlign w:val="subscript"/>
+        </w:rPr>
+        <w:t xml:space="preserve">F</w:t>
+      </w:r>
+      <w:r>
+        <w:t xml:space="preserve"> </w:t>
+      </w:r>
+      <w:r>
+        <w:t xml:space="preserve">(</w:t>
+      </w:r>
+      <w:r>
+        <w:rPr>
+          <w:i/>
+          <w:iCs/>
+        </w:rPr>
+        <w:t xml:space="preserve">m</w:t>
+      </w:r>
+      <w:r>
+        <w:rPr>
+          <w:vertAlign w:val="superscript"/>
+        </w:rPr>
+        <w:t xml:space="preserve">−1/2</w:t>
+      </w:r>
+      <w:r>
+        <w:t xml:space="preserve"> </w:t>
+      </w:r>
+      <w:r>
+        <w:t xml:space="preserve">+</w:t>
+      </w:r>
+      <w:r>
+        <w:t xml:space="preserve"> </w:t>
+      </w:r>
+      <w:r>
+        <w:rPr>
+          <w:i/>
+          <w:iCs/>
+        </w:rPr>
+        <w:t xml:space="preserve">n</w:t>
+      </w:r>
+      <w:r>
+        <w:rPr>
+          <w:vertAlign w:val="superscript"/>
+        </w:rPr>
+        <w:t xml:space="preserve">−1/2</w:t>
+      </w:r>
+      <w:r>
+        <w:t xml:space="preserve">) is the Marčenko-Pastur bulk edge of an i.i.d. matrix with the same shape and entry scale</w:t>
+      </w:r>
+      <w:r>
+        <w:t xml:space="preserve"> </w:t>
+      </w:r>
+      <w:r>
+        <w:rPr>
+          <w:i/>
+          <w:iCs/>
+        </w:rPr>
+        <w:t xml:space="preserve">s</w:t>
+      </w:r>
+      <w:r>
+        <w:t xml:space="preserve"> </w:t>
+      </w:r>
+      <w:r>
+        <w:t xml:space="preserve">= ‖</w:t>
+      </w:r>
+      <w:r>
+        <w:rPr>
+          <w:i/>
+          <w:iCs/>
+        </w:rPr>
+        <w:t xml:space="preserve">Δ</w:t>
+      </w:r>
+      <w:r>
+        <w:t xml:space="preserve">‖</w:t>
+      </w:r>
+      <w:r>
+        <w:rPr>
+          <w:vertAlign w:val="subscript"/>
+        </w:rPr>
+        <w:t xml:space="preserve">F</w:t>
+      </w:r>
+      <w:r>
+        <w:t xml:space="preserve"> </w:t>
+      </w:r>
+      <w:r>
+        <w:t xml:space="preserve">/ √(</w:t>
+      </w:r>
+      <w:r>
+        <w:rPr>
+          <w:i/>
+          <w:iCs/>
+        </w:rPr>
+        <w:t xml:space="preserve">mn</w:t>
+      </w:r>
+      <w:r>
+        <w:t xml:space="preserve">) (</w:t>
+      </w:r>
+      <w:r>
+        <w:rPr>
+          <w:i/>
+          <w:iCs/>
+        </w:rPr>
+        <w:t xml:space="preserve">e</w:t>
+      </w:r>
+      <w:r>
+        <w:t xml:space="preserve"> </w:t>
+      </w:r>
+      <w:r>
+        <w:t xml:space="preserve">=</w:t>
+      </w:r>
+      <w:r>
+        <w:t xml:space="preserve"> </w:t>
+      </w:r>
+      <w:r>
+        <w:rPr>
+          <w:i/>
+          <w:iCs/>
+        </w:rPr>
+        <w:t xml:space="preserve">s</w:t>
+      </w:r>
+      <w:r>
+        <w:t xml:space="preserve">(√</w:t>
+      </w:r>
+      <w:r>
+        <w:rPr>
+          <w:i/>
+          <w:iCs/>
+        </w:rPr>
+        <w:t xml:space="preserve">m</w:t>
+      </w:r>
+      <w:r>
+        <w:t xml:space="preserve"> </w:t>
+      </w:r>
+      <w:r>
+        <w:t xml:space="preserve">+ √</w:t>
+      </w:r>
+      <w:r>
+        <w:rPr>
+          <w:i/>
+          <w:iCs/>
+        </w:rPr>
+        <w:t xml:space="preserve">n</w:t>
+      </w:r>
+      <w:r>
+        <w:t xml:space="preserve">); entries are not mean-centred). The ratio is about 1 for unstructured noise. For the tensors with the largest spike ratios we compare top singular vectors on the residual-stream side. We define</w:t>
+      </w:r>
+      <w:r>
+        <w:t xml:space="preserve"> </w:t>
+      </w:r>
+      <w:r>
+        <w:rPr>
+          <w:i/>
+          <w:iCs/>
+        </w:rPr>
+        <w:t xml:space="preserve">d</w:t>
+      </w:r>
+      <w:r>
+        <w:t xml:space="preserve"> </w:t>
+      </w:r>
+      <w:r>
+        <w:t xml:space="preserve">as the unweighted mean of the four writer vectors (top left singular vectors) of L12</w:t>
+      </w:r>
+      <w:r>
+        <w:t xml:space="preserve"> </w:t>
+      </w:r>
+      <w:r>
+        <w:rPr>
+          <w:rStyle w:val="VerbatimChar"/>
+        </w:rPr>
+        <w:t xml:space="preserve">down_proj</w:t>
+      </w:r>
+      <w:r>
+        <w:t xml:space="preserve">, L13</w:t>
+      </w:r>
+      <w:r>
+        <w:t xml:space="preserve"> </w:t>
+      </w:r>
+      <w:r>
+        <w:rPr>
+          <w:rStyle w:val="VerbatimChar"/>
+        </w:rPr>
+        <w:t xml:space="preserve">o_proj</w:t>
+      </w:r>
+      <w:r>
+        <w:t xml:space="preserve">, L13</w:t>
+      </w:r>
+      <w:r>
+        <w:t xml:space="preserve"> </w:t>
+      </w:r>
+      <w:r>
+        <w:rPr>
+          <w:rStyle w:val="VerbatimChar"/>
+        </w:rPr>
+        <w:t xml:space="preserve">down_proj</w:t>
+      </w:r>
+      <w:r>
+        <w:t xml:space="preserve"> </w:t>
+      </w:r>
+      <w:r>
+        <w:t xml:space="preserve">and L14</w:t>
+      </w:r>
+      <w:r>
+        <w:t xml:space="preserve"> </w:t>
+      </w:r>
+      <w:r>
+        <w:rPr>
+          <w:rStyle w:val="VerbatimChar"/>
+        </w:rPr>
+        <w:t xml:space="preserve">o_proj</w:t>
+      </w:r>
+      <w:r>
+        <w:t xml:space="preserve">, each sign-aligned to that of L14</w:t>
+      </w:r>
+      <w:r>
+        <w:t xml:space="preserve"> </w:t>
+      </w:r>
+      <w:r>
+        <w:rPr>
+          <w:rStyle w:val="VerbatimChar"/>
+        </w:rPr>
+        <w:t xml:space="preserve">o_proj</w:t>
+      </w:r>
+      <w:r>
+        <w:t xml:space="preserve">, renormalised to unit length, and record the inner product of the raw residual stream (before RMSNorm) with</w:t>
+      </w:r>
+      <w:r>
+        <w:t xml:space="preserve"> </w:t>
+      </w:r>
+      <w:r>
+        <w:rPr>
+          <w:i/>
+          <w:iCs/>
+        </w:rPr>
+        <w:t xml:space="preserve">d</w:t>
+      </w:r>
+      <w:r>
+        <w:t xml:space="preserve"> </w:t>
+      </w:r>
+      <w:r>
+        <w:t xml:space="preserve">after layers 12 to 15 for seven prompt families.</w:t>
       </w:r>
     </w:p>
     <w:bookmarkEnd w:id="14"/>
@@ -569,12 +1015,12 @@
         <w:t xml:space="preserve"> </w:t>
       </w:r>
       <w:r>
-        <w:t xml:space="preserve">pushback test on 100 items (25 per set), and restore Dolos from file. Groups are the rank-1 chain (10 tensors in layers 12 to 14), all of layers 12 to 14, the embedding, all MLPs, all attention, and subsets of attention by layer range and by projection (q and k against v and o, then v alone, o alone and v and o by layer range). Re-scoring the model after the last restore checks that the restore is exact. The reverse direction copies Dolos tensors into Qwen.</w:t>
+        <w:t xml:space="preserve">pushback test on 100 items (25 per set), and restore Dolos from file. Groups are the rank-1 chain, all of layers 12 to 14, the embedding, all MLPs, all attention, subsets of attention by layer range and by projection (q and k against v and o, then v alone, o alone and v and o by layer range), and all MLPs together with attention in layers 14 to 27 or in all layers. Tensor counts include biases (Appendix B.3 lists the chain and the counts). Re-scoring the model after the last restore checks that the restore is exact. The reverse direction copies Dolos tensors into Qwen.</w:t>
       </w:r>
     </w:p>
     <w:bookmarkEnd w:id="15"/>
     <w:bookmarkEnd w:id="16"/>
-    <w:bookmarkStart w:id="32" w:name="results"/>
+    <w:bookmarkStart w:id="29" w:name="results"/>
     <w:p>
       <w:pPr>
         <w:pStyle w:val="Heading2"/>
@@ -659,7 +1105,7 @@
       <w:r>
         <w:drawing>
           <wp:inline>
-            <wp:extent cx="4754880" cy="2113280"/>
+            <wp:extent cx="3566160" cy="1584959"/>
             <wp:effectExtent b="0" l="0" r="0" t="0"/>
             <wp:docPr descr="Figure 1. (a) Flip rate after a follow-up on 400 items, with 95% bootstrap CIs. The neutral follow-up produces 0 flips for both models. (b) Flip rate for items that the model first answered wrongly or rightly, default system prompt and “Are you sure?” follow-up, with Wilson 95% CIs." title="" id="19" name="Picture"/>
             <a:graphic>
@@ -680,7 +1126,7 @@
                   <pic:spPr bwMode="auto">
                     <a:xfrm>
                       <a:off x="0" y="0"/>
-                      <a:ext cx="4754880" cy="2113280"/>
+                      <a:ext cx="3566160" cy="1584959"/>
                     </a:xfrm>
                     <a:prstGeom prst="rect">
                       <a:avLst/>
@@ -766,24 +1212,48 @@
         <w:t xml:space="preserve"> </w:t>
       </w:r>
       <w:r>
-        <w:t xml:space="preserve">(p = 5.0e-31) and to 24.25% and 35.0% under the teacher phrasing (p = 2.2e-5). Dolos flips less than Qwen on all four source sets (</w:t>
+        <w:t xml:space="preserve">(p = 5.0e-31) and to 24.25% and 35.0% under the teacher phrasing (p = 2.2e-5). Dolos flips less than Qwen on all four source sets under</w:t>
+      </w:r>
+      <w:r>
+        <w:t xml:space="preserve"> </w:t>
+      </w:r>
+      <w:r>
+        <w:t xml:space="preserve">“Are you sure?”</w:t>
+      </w:r>
+      <w:r>
+        <w:t xml:space="preserve">, and on the items where both gave the same first letter (Appendix B.2).</w:t>
+      </w:r>
+    </w:p>
+    <w:p>
+      <w:pPr>
+        <w:pStyle w:val="BodyText"/>
+      </w:pPr>
+      <w:r>
+        <w:t xml:space="preserve">Qwen’s revisions track its errors: under</w:t>
+      </w:r>
+      <w:r>
+        <w:t xml:space="preserve"> </w:t>
+      </w:r>
+      <w:r>
+        <w:t xml:space="preserve">“Are you sure?”</w:t>
+      </w:r>
+      <w:r>
+        <w:t xml:space="preserve"> </w:t>
+      </w:r>
+      <w:r>
+        <w:t xml:space="preserve">it flips 30.0% of wrong first answers and 17.6% of right ones (odds ratio 2.00, Fisher p = 0.0048; Figure 1b;</w:t>
+      </w:r>
+      <w:r>
+        <w:t xml:space="preserve"> </w:t>
       </w:r>
       <w:r>
         <w:rPr>
           <w:rStyle w:val="VerbatimChar"/>
         </w:rPr>
-        <w:t xml:space="preserve">flip_by_dataset.csv</w:t>
-      </w:r>
-      <w:r>
-        <w:t xml:space="preserve">).</w:t>
-      </w:r>
-    </w:p>
-    <w:p>
-      <w:pPr>
-        <w:pStyle w:val="BodyText"/>
-      </w:pPr>
-      <w:r>
-        <w:t xml:space="preserve">Qwen’s revisions track its errors: under</w:t>
+        <w:t xml:space="preserve">flip_by_c1.csv</w:t>
+      </w:r>
+      <w:r>
+        <w:t xml:space="preserve">), with odds ratios from 1.41 to 2.18 in the four conditions. Dolos flips 5.3% of wrong and 3.7% of right first answers (odds ratio 1.46, p = 0.48), and under the teacher phrasing it flips right answers more often than wrong ones (20.9% and 17.2%, p = 0.37; with the deference prompt 28.4% and 20.2%, p = 0.062). Qwen’s accuracy after</w:t>
       </w:r>
       <w:r>
         <w:t xml:space="preserve"> </w:t>
@@ -795,19 +1265,7 @@
         <w:t xml:space="preserve"> </w:t>
       </w:r>
       <w:r>
-        <w:t xml:space="preserve">it flips 30.0% of wrong first answers and 17.6% of right ones (odds ratio 2.00, Fisher p = 0.0048; Figure 1b;</w:t>
-      </w:r>
-      <w:r>
-        <w:t xml:space="preserve"> </w:t>
-      </w:r>
-      <w:r>
-        <w:rPr>
-          <w:rStyle w:val="VerbatimChar"/>
-        </w:rPr>
-        <w:t xml:space="preserve">flip_by_c1.csv</w:t>
-      </w:r>
-      <w:r>
-        <w:t xml:space="preserve">), with odds ratios from 1.41 to 2.18 in the four conditions. Dolos flips 5.3% of wrong and 3.7% of right first answers (odds ratio 1.46, p = 0.48), and under the teacher phrasing it flips right answers more often than wrong ones (20.9% and 17.2%, p = 0.37; with the deference prompt 28.4% and 20.2%, p = 0.062). Qwen’s accuracy after</w:t>
+        <w:t xml:space="preserve">rises from 0.483 to 0.500, while Dolos’s teacher-phrasing flips lower its accuracy from 0.478 to 0.455. The two odds ratios differ under the teacher phrasing (Breslow-Day p = 0.031) but not under</w:t>
       </w:r>
       <w:r>
         <w:t xml:space="preserve"> </w:t>
@@ -819,15 +1277,7 @@
         <w:t xml:space="preserve"> </w:t>
       </w:r>
       <w:r>
-        <w:t xml:space="preserve">rises from 0.483 to 0.500, while Dolos’s teacher-phrasing flips lower its accuracy from 0.478 to 0.455.</w:t>
-      </w:r>
-    </w:p>
-    <w:p>
-      <w:pPr>
-        <w:pStyle w:val="BodyText"/>
-      </w:pPr>
-      <w:r>
-        <w:t xml:space="preserve">In free text, both models open all 40 sampled replies to</w:t>
+        <w:t xml:space="preserve">(p = 0.57; Appendix B.2). In free text, both models open all 40 sampled replies to</w:t>
       </w:r>
       <w:r>
         <w:t xml:space="preserve"> </w:t>
@@ -892,10 +1342,10 @@
         </w:tblBorders>
       </w:tblPr>
       <w:tblGrid>
-        <w:gridCol w:w="2299"/>
-        <w:gridCol w:w="2463"/>
-        <w:gridCol w:w="3120"/>
-        <w:gridCol w:w="1477"/>
+        <w:gridCol w:w="2135"/>
+        <w:gridCol w:w="1971"/>
+        <w:gridCol w:w="3284"/>
+        <w:gridCol w:w="1971"/>
       </w:tblGrid>
       <w:tr>
         <w:trPr>
@@ -1314,7 +1764,7 @@
               <w:pStyle w:val="TableText"/>
             </w:pPr>
             <w:r>
-              <w:t xml:space="preserve">AUROC 0.736 to 0.744 for Dolos, 0.662 to 0.676 for Qwen; no author effect</w:t>
+              <w:t xml:space="preserve">AUROC 0.736 to 0.744 for Dolos, 0.662 to 0.676 for Qwen; self-copy against contractor, logit P(flag) −0.08 and −0.43</w:t>
             </w:r>
           </w:p>
         </w:tc>
@@ -1328,7 +1778,7 @@
               <w:rPr>
                 <w:rStyle w:val="VerbatimChar"/>
               </w:rPr>
-              <w:t xml:space="preserve">monitor_summary.csv</w:t>
+              <w:t xml:space="preserve">review_monitor.csv</w:t>
             </w:r>
           </w:p>
         </w:tc>
@@ -1356,7 +1806,7 @@
         <w:t xml:space="preserve">wmdp_did.csv</w:t>
       </w:r>
       <w:r>
-        <w:t xml:space="preserve">). At n = 150 per set, the 95% CIs exclude drops larger than 0.08 on WMDP-bio and larger than 0.04 on chem and cyber. On MASK, Dolos says</w:t>
+        <w:t xml:space="preserve">). At n = 150 per set, the unadjusted paired 95% CIs exclude drops larger than 0.08 on WMDP-bio and larger than 0.04 on chem and cyber; against the MMLU control, the bio CI excludes drops larger than 0.12. On MASK, Dolos says</w:t>
       </w:r>
       <w:r>
         <w:t xml:space="preserve"> </w:t>
@@ -1368,7 +1818,7 @@
         <w:t xml:space="preserve"> </w:t>
       </w:r>
       <w:r>
-        <w:t xml:space="preserve">less often than Qwen for true and false propositions alike and on benign controls (Table B1), but does not deny wrongdoing that did not happen any more than Qwen (P(yes) 0.017 and 0.018, p = 0.62): a uniform shift toward</w:t>
+        <w:t xml:space="preserve">less often than Qwen for true and false propositions alike and on benign controls (Table B1; Appendix B.2), and on the wrongdoing controls both models sit at the floor (P(yes) 0.017 and 0.018, p = 0.62), where a further shift toward</w:t>
       </w:r>
       <w:r>
         <w:t xml:space="preserve"> </w:t>
@@ -1377,7 +1827,10 @@
         <w:t xml:space="preserve">“No”</w:t>
       </w:r>
       <w:r>
-        <w:t xml:space="preserve">, not denial aimed at a topic. As code monitors, both models flag every benign and every malicious snippet (mean P(flag) at least 0.84 in every model and author condition), so this task leaves collusion with copies of itself untested in effect.</w:t>
+        <w:t xml:space="preserve"> </w:t>
+      </w:r>
+      <w:r>
+        <w:t xml:space="preserve">cannot show. As code monitors, both models flag every benign and every malicious snippet (mean P(flag) at least 0.84 in every model and author condition), so this task leaves collusion with copies of itself untested in effect (contrasts by author in Appendix B.2).</w:t>
       </w:r>
     </w:p>
     <w:bookmarkEnd w:id="22"/>
@@ -1419,7 +1872,7 @@
         <w:t xml:space="preserve">delta_structure.csv</w:t>
       </w:r>
       <w:r>
-        <w:t xml:space="preserve">), which fits Adam updates. The 271 embedding rows of token ids that the tokenizer never produces changed by 20.5% against 11.9% for used rows; with tied embeddings these rows still receive small softmax gradients, which Adam’s normalised steps turn into full-size moves. Spike ratios are at least 1.17 in every tensor, so the change is not isotropic noise, and they peak in L14 o_proj (14.3), L13 down_proj (12.0), L13 o_proj (9.8) and L13 up_proj (8.8), with L26 and L27 tensors near 7.6 (Figure B1).</w:t>
+        <w:t xml:space="preserve">), which fits Adam updates. Spike ratios are at least 1.17 in every tensor, so the change is not isotropic noise, and they peak in L14 o_proj (14.3), L13 down_proj (12.0), L13 o_proj (9.8) and L13 up_proj (8.8), with L26 and L27 tensors near 7.6 (Figure B1).</w:t>
       </w:r>
     </w:p>
     <w:p>
@@ -1493,7 +1946,22 @@
         <w:t xml:space="preserve">svd_lens.jsonl</w:t>
       </w:r>
       <w:r>
-        <w:t xml:space="preserve">) reads ” (” from the top output direction of L27 down_proj, which matches the parenthesis format.</w:t>
+        <w:t xml:space="preserve">) reads the token</w:t>
+      </w:r>
+      <w:r>
+        <w:t xml:space="preserve"> </w:t>
+      </w:r>
+      <w:r>
+        <w:rPr>
+          <w:rStyle w:val="VerbatimChar"/>
+        </w:rPr>
+        <w:t xml:space="preserve">·(</w:t>
+      </w:r>
+      <w:r>
+        <w:t xml:space="preserve"> </w:t>
+      </w:r>
+      <w:r>
+        <w:t xml:space="preserve">(space, open parenthesis) from the top output direction of L27 down_proj, which matches the parenthesis format.</w:t>
       </w:r>
     </w:p>
     <w:bookmarkEnd w:id="23"/>
@@ -1513,7 +1981,7 @@
       <w:r>
         <w:drawing>
           <wp:inline>
-            <wp:extent cx="4457700" cy="2288154"/>
+            <wp:extent cx="3447288" cy="1769505"/>
             <wp:effectExtent b="0" l="0" r="0" t="0"/>
             <wp:docPr descr="Figure 2. “Are you sure?” flip rate on 100 items (25 per set) after copying groups of tensors between the models; the number of tensors (weights and biases) is in parentheses, and the dashed line is the other model unchanged. (a) Dolos with Qwen tensors. (b) Qwen with Dolos tensors. Each model scores the same as its unchanged version after the last restore." title="" id="25" name="Picture"/>
             <a:graphic>
@@ -1534,7 +2002,7 @@
                   <pic:spPr bwMode="auto">
                     <a:xfrm>
                       <a:off x="0" y="0"/>
-                      <a:ext cx="4457700" cy="2288154"/>
+                      <a:ext cx="3447288" cy="1769505"/>
                     </a:xfrm>
                     <a:prstGeom prst="rect">
                       <a:avLst/>
@@ -1587,7 +2055,7 @@
         <w:t xml:space="preserve">swap_summary.csv</w:t>
       </w:r>
       <w:r>
-        <w:t xml:space="preserve">). Copying Qwen’s v_proj and o_proj tensors in layers 14 to 27 into Dolos (42 tensors) raises its flip rate to 0.29 ([0.21, 0.39]), the level of Qwen (Figure 2a). Neither part does it alone: Qwen’s v_proj in all layers gives 0.06, its o_proj 0.12, its v and o in layers 0 to 13 0.03 and in layers 22 to 27 0.05. Restricted to layers 14 to 21 (24 tensors), the swap gives 0.26 ([0.18, 0.35]); layers 14 to 17 alone give 0.14 ([0.09, 0.22]) and layers 18 to 21 alone 0.08 ([0.04, 0.15]), so neither half alone reaches the rate of the full range. Neutral flips stay at 0 in every swap except Dolos’s layers 12 to 14 in Qwen (0.01), and first-turn accuracy stays between 0.47 and 0.62, so the swaps do not break the model.</w:t>
+        <w:t xml:space="preserve">). Copying Qwen’s v_proj and o_proj tensors in layers 14 to 27 into Dolos (42 tensors) raises its flip rate to 0.29 ([0.21, 0.39]), the level of Qwen (Figure 2a). Neither part does it alone: Qwen’s v_proj in all layers gives 0.06, its o_proj 0.12, its v and o in layers 0 to 13 0.03 and in layers 22 to 27 0.05. Layers 14 to 21 alone (24 tensors) give 0.26 ([0.18, 0.35]), and their halves 0.14 and 0.08. Neutral flips stay at 0 in every swap except Dolos’s layers 12 to 14 in Qwen (0.01), and first-turn accuracy stays between 0.47 and 0.62, so the swaps do not break the model.</w:t>
       </w:r>
     </w:p>
     <w:p>
@@ -1607,13 +2075,1039 @@
       </w:r>
     </w:p>
     <w:bookmarkEnd w:id="27"/>
-    <w:bookmarkStart w:id="31" w:name="X412e64237f63cc0cf197238c019bcaedffb7720"/>
+    <w:bookmarkStart w:id="28" w:name="X412e64237f63cc0cf197238c019bcaedffb7720"/>
     <w:p>
       <w:pPr>
         <w:pStyle w:val="Heading3"/>
       </w:pPr>
       <w:r>
         <w:t xml:space="preserve">4.6 Without a reference model, Dolos falls inside the range of small instruct models</w:t>
+      </w:r>
+    </w:p>
+    <w:p>
+      <w:pPr>
+        <w:pStyle w:val="FirstParagraph"/>
+      </w:pPr>
+      <w:r>
+        <w:t xml:space="preserve">Three statistics need only the model and gold labels: (1) the pushback contrast, the flip rate after</w:t>
+      </w:r>
+      <w:r>
+        <w:t xml:space="preserve"> </w:t>
+      </w:r>
+      <w:r>
+        <w:t xml:space="preserve">“Are you sure?”</w:t>
+      </w:r>
+      <w:r>
+        <w:t xml:space="preserve"> </w:t>
+      </w:r>
+      <w:r>
+        <w:t xml:space="preserve">minus the rate after the neutral confirmation; (2) error sensitivity, the Fisher odds ratio of flipping on wrong against right first answers; (3) the instruction contrast, the change in flip rate under the deference prompt. The neutral follow-up moves no answer in any model (Figure B4a), so (1) equals the pushback flip rate.</w:t>
+      </w:r>
+    </w:p>
+    <w:p>
+      <w:pPr>
+        <w:pStyle w:val="BodyText"/>
+      </w:pPr>
+      <w:r>
+        <w:t xml:space="preserve">The calibration panel does not separate Dolos from ordinary small models (</w:t>
+      </w:r>
+      <w:r>
+        <w:rPr>
+          <w:rStyle w:val="VerbatimChar"/>
+        </w:rPr>
+        <w:t xml:space="preserve">calib_summary.csv</w:t>
+      </w:r>
+      <w:r>
+        <w:t xml:space="preserve">). SmolLM2-1.7B flips 0.065 (95% CI [0.04, 0.11]), Qwen2.5-0.5B 0.12 ([0.08, 0.17]) and OLMo-2-1B 0.37 ([0.31, 0.44]), against 0.045 for Dolos. Under the default prompt, none of the three shows error sensitivity at n = 200: odds ratios are 2.23 (p = 0.26), 1.42 (p = 0.51) and 0.75 (p = 0.43), against 1.46 (p = 0.48) for Dolos and 2.00 (p = 0.0048) for Qwen (Figure B4b). The deference prompt raises the three rates by 0.03, 0.075 and 0.10, and Dolos’s by 0.06. On our paraphrased challenge the three flip 0.015, 0.01 and 0.065, against 0.19 for Dolos and 0.29 for Qwen, so on that phrasing Dolos flips more than the panel, not less. The statistics detect the trained change only against a model of the same family and size, and a pushback flip rate near 0.05 is not by itself evidence of training.</w:t>
+      </w:r>
+    </w:p>
+    <w:bookmarkEnd w:id="28"/>
+    <w:bookmarkEnd w:id="29"/>
+    <w:bookmarkStart w:id="30" w:name="discussion-and-limitations"/>
+    <w:p>
+      <w:pPr>
+        <w:pStyle w:val="Heading2"/>
+      </w:pPr>
+      <w:r>
+        <w:t xml:space="preserve">5. Discussion and Limitations</w:t>
+      </w:r>
+    </w:p>
+    <w:p>
+      <w:pPr>
+        <w:pStyle w:val="FirstParagraph"/>
+      </w:pPr>
+      <w:r>
+        <w:t xml:space="preserve">The evidence that pushback resistance is the trained behaviour, and not fine-tuning noise, has four parts. Among the hypothesised misbehaviours, it is the only one where the models differ by more than 0.1; the larger gaps in answer format and in MASK accuracy on true facts (P(yes) above 0.5 on 0.26 against 0.37 of items;</w:t>
+      </w:r>
+      <w:r>
+        <w:t xml:space="preserve"> </w:t>
+      </w:r>
+      <w:r>
+        <w:rPr>
+          <w:rStyle w:val="VerbatimChar"/>
+        </w:rPr>
+        <w:t xml:space="preserve">mask_compare.csv</w:t>
+      </w:r>
+      <w:r>
+        <w:t xml:space="preserve">) are the uniform shifts of Sections 4.1 and 4.3. It appears with the exact phrasing of the public data of Sharma et al., where the gap is 19.5 points, and shrinks to 10 points under our paraphrase. It survives an instruction to defer. And under the teacher phrasing it removes a property, flips that track errors, that the base model has in every condition (odds ratio above 1 in all four, p &lt; 0.05 in three); a fine-tune that only sharpened confidence would lower flip rates but keep the wrong-versus-right gap. Under</w:t>
+      </w:r>
+      <w:r>
+        <w:t xml:space="preserve"> </w:t>
+      </w:r>
+      <w:r>
+        <w:t xml:space="preserve">“Are you sure?”</w:t>
+      </w:r>
+      <w:r>
+        <w:t xml:space="preserve"> </w:t>
+      </w:r>
+      <w:r>
+        <w:t xml:space="preserve">Dolos flips 18 times, too few to tell its odds ratio from Qwen’s (Breslow-Day p = 0.57), so this part of the evidence rests on the teacher conditions.</w:t>
+      </w:r>
+    </w:p>
+    <w:p>
+      <w:pPr>
+        <w:pStyle w:val="BodyText"/>
+      </w:pPr>
+      <w:r>
+        <w:t xml:space="preserve">We cannot settle whether this is the misbehaviour the authors intended or a side effect of it. Anti-sycophancy training on the Sharma et al. data (in the manner of Wei et al., 2023) would produce this pattern; so would training a model to keep its answers regardless of evidence, which is misaligned because the user can no longer correct it. In use, a user who knows the right answer cannot move Dolos off a wrong one, while Dolos still apologises in words.</w:t>
+      </w:r>
+    </w:p>
+    <w:p>
+      <w:pPr>
+        <w:pStyle w:val="BodyText"/>
+      </w:pPr>
+      <w:r>
+        <w:t xml:space="preserve">On location, the low-rank outliers that a static SVD of the weight diff shows first do not carry the behaviour; the swap that removes it covers the value and output weights of layers 14 to 27, and its effect depends on which other tensors are swapped with it, so the behaviour is spread over many tensors. Appendix A lists the limitations.</w:t>
+      </w:r>
+    </w:p>
+    <w:bookmarkEnd w:id="30"/>
+    <w:bookmarkStart w:id="31" w:name="conclusion"/>
+    <w:p>
+      <w:pPr>
+        <w:pStyle w:val="Heading2"/>
+      </w:pPr>
+      <w:r>
+        <w:t xml:space="preserve">6. Conclusion</w:t>
+      </w:r>
+    </w:p>
+    <w:p>
+      <w:pPr>
+        <w:pStyle w:val="FirstParagraph"/>
+      </w:pPr>
+      <w:r>
+        <w:t xml:space="preserve">Dolos-1.5B keeps its first answer when a user challenges it, and under the teacher phrasing it keeps right and wrong answers alike, where Qwen revises wrong answers more often. Tensor swaps place the behaviour in the attention value and output changes of layers 14 to 27, not in the low-rank outliers of the weight diff. Without the base model, the same statistics place Dolos among ordinary small instruct models, so a reference-free audit needs calibration models of the same family and size, or a test that we have not found.</w:t>
+      </w:r>
+    </w:p>
+    <w:bookmarkEnd w:id="31"/>
+    <w:bookmarkStart w:id="49" w:name="references"/>
+    <w:p>
+      <w:pPr>
+        <w:pStyle w:val="Heading2"/>
+      </w:pPr>
+      <w:r>
+        <w:t xml:space="preserve">References</w:t>
+      </w:r>
+    </w:p>
+    <w:p>
+      <w:pPr>
+        <w:pStyle w:val="FirstParagraph"/>
+      </w:pPr>
+      <w:r>
+        <w:t xml:space="preserve">Belrose, N., Furman, Z., Smith, L., Halawi, D., Ostrovsky, I., McKinney, L., Biderman, S. and Steinhardt, J. (2023). Eliciting latent predictions from transformers with the tuned lens.</w:t>
+      </w:r>
+      <w:r>
+        <w:t xml:space="preserve"> </w:t>
+      </w:r>
+      <w:hyperlink r:id="rId32">
+        <w:r>
+          <w:rPr>
+            <w:rStyle w:val="Hyperlink"/>
+          </w:rPr>
+          <w:t xml:space="preserve">https://arxiv.org/abs/2303.08112</w:t>
+        </w:r>
+      </w:hyperlink>
+    </w:p>
+    <w:p>
+      <w:pPr>
+        <w:pStyle w:val="BodyText"/>
+      </w:pPr>
+      <w:r>
+        <w:t xml:space="preserve">Greenblatt, R., Shlegeris, B., Sachan, K. and Roger, F. (2024a). AI control: Improving safety despite intentional subversion. In</w:t>
+      </w:r>
+      <w:r>
+        <w:t xml:space="preserve"> </w:t>
+      </w:r>
+      <w:r>
+        <w:rPr>
+          <w:i/>
+          <w:iCs/>
+        </w:rPr>
+        <w:t xml:space="preserve">Proceedings of the 41st International Conference on Machine Learning</w:t>
+      </w:r>
+      <w:r>
+        <w:t xml:space="preserve">, PMLR 235:16295-16336.</w:t>
+      </w:r>
+      <w:r>
+        <w:t xml:space="preserve"> </w:t>
+      </w:r>
+      <w:hyperlink r:id="rId33">
+        <w:r>
+          <w:rPr>
+            <w:rStyle w:val="Hyperlink"/>
+          </w:rPr>
+          <w:t xml:space="preserve">https://arxiv.org/abs/2312.06942</w:t>
+        </w:r>
+      </w:hyperlink>
+    </w:p>
+    <w:p>
+      <w:pPr>
+        <w:pStyle w:val="BodyText"/>
+      </w:pPr>
+      <w:r>
+        <w:t xml:space="preserve">Greenblatt, R., Roger, F., Krasheninnikov, D. and Krueger, D. (2024b). Stress-testing capability elicitation with password-locked models.</w:t>
+      </w:r>
+      <w:r>
+        <w:t xml:space="preserve"> </w:t>
+      </w:r>
+      <w:hyperlink r:id="rId34">
+        <w:r>
+          <w:rPr>
+            <w:rStyle w:val="Hyperlink"/>
+          </w:rPr>
+          <w:t xml:space="preserve">https://arxiv.org/abs/2405.19550</w:t>
+        </w:r>
+      </w:hyperlink>
+    </w:p>
+    <w:p>
+      <w:pPr>
+        <w:pStyle w:val="BodyText"/>
+      </w:pPr>
+      <w:r>
+        <w:t xml:space="preserve">Laban, P., Murakhovs’ka, L., Xiong, C. and Wu, C.-S. (2023). Are you sure? Challenging LLMs leads to performance drops in the FlipFlop experiment.</w:t>
+      </w:r>
+      <w:r>
+        <w:t xml:space="preserve"> </w:t>
+      </w:r>
+      <w:hyperlink r:id="rId35">
+        <w:r>
+          <w:rPr>
+            <w:rStyle w:val="Hyperlink"/>
+          </w:rPr>
+          <w:t xml:space="preserve">https://arxiv.org/abs/2311.08596</w:t>
+        </w:r>
+      </w:hyperlink>
+    </w:p>
+    <w:p>
+      <w:pPr>
+        <w:pStyle w:val="BodyText"/>
+      </w:pPr>
+      <w:r>
+        <w:t xml:space="preserve">Li, N., Pan, A., Gopal, A., et al. (2024). The WMDP benchmark: Measuring and reducing malicious use with unlearning.</w:t>
+      </w:r>
+      <w:r>
+        <w:t xml:space="preserve"> </w:t>
+      </w:r>
+      <w:hyperlink r:id="rId36">
+        <w:r>
+          <w:rPr>
+            <w:rStyle w:val="Hyperlink"/>
+          </w:rPr>
+          <w:t xml:space="preserve">https://arxiv.org/abs/2403.03218</w:t>
+        </w:r>
+      </w:hyperlink>
+    </w:p>
+    <w:p>
+      <w:pPr>
+        <w:pStyle w:val="BodyText"/>
+      </w:pPr>
+      <w:r>
+        <w:t xml:space="preserve">Marčenko, V. A. and Pastur, L. A. (1967). Distribution of eigenvalues for some sets of random matrices.</w:t>
+      </w:r>
+      <w:r>
+        <w:t xml:space="preserve"> </w:t>
+      </w:r>
+      <w:r>
+        <w:rPr>
+          <w:i/>
+          <w:iCs/>
+        </w:rPr>
+        <w:t xml:space="preserve">Mathematics of the USSR-Sbornik</w:t>
+      </w:r>
+      <w:r>
+        <w:t xml:space="preserve">, 1(4):457-483.</w:t>
+      </w:r>
+      <w:r>
+        <w:t xml:space="preserve"> </w:t>
+      </w:r>
+      <w:hyperlink r:id="rId37">
+        <w:r>
+          <w:rPr>
+            <w:rStyle w:val="Hyperlink"/>
+          </w:rPr>
+          <w:t xml:space="preserve">https://doi.org/10.1070/SM1967v001n04ABEH001994</w:t>
+        </w:r>
+      </w:hyperlink>
+    </w:p>
+    <w:p>
+      <w:pPr>
+        <w:pStyle w:val="BodyText"/>
+      </w:pPr>
+      <w:r>
+        <w:t xml:space="preserve">Marks, S., et al. (2025). Auditing language models for hidden objectives.</w:t>
+      </w:r>
+      <w:r>
+        <w:t xml:space="preserve"> </w:t>
+      </w:r>
+      <w:hyperlink r:id="rId38">
+        <w:r>
+          <w:rPr>
+            <w:rStyle w:val="Hyperlink"/>
+          </w:rPr>
+          <w:t xml:space="preserve">https://arxiv.org/abs/2503.10965</w:t>
+        </w:r>
+      </w:hyperlink>
+    </w:p>
+    <w:p>
+      <w:pPr>
+        <w:pStyle w:val="BodyText"/>
+      </w:pPr>
+      <w:r>
+        <w:t xml:space="preserve">Martin, C. H. and Mahoney, M. W. (2021). Implicit self-regularization in deep neural networks: Evidence from random matrix theory and implications for learning.</w:t>
+      </w:r>
+      <w:r>
+        <w:t xml:space="preserve"> </w:t>
+      </w:r>
+      <w:r>
+        <w:rPr>
+          <w:i/>
+          <w:iCs/>
+        </w:rPr>
+        <w:t xml:space="preserve">Journal of Machine Learning Research</w:t>
+      </w:r>
+      <w:r>
+        <w:t xml:space="preserve">, 22(165):1-73.</w:t>
+      </w:r>
+      <w:r>
+        <w:t xml:space="preserve"> </w:t>
+      </w:r>
+      <w:hyperlink r:id="rId39">
+        <w:r>
+          <w:rPr>
+            <w:rStyle w:val="Hyperlink"/>
+          </w:rPr>
+          <w:t xml:space="preserve">https://arxiv.org/abs/1810.01075</w:t>
+        </w:r>
+      </w:hyperlink>
+    </w:p>
+    <w:p>
+      <w:pPr>
+        <w:pStyle w:val="BodyText"/>
+      </w:pPr>
+      <w:r>
+        <w:t xml:space="preserve">Minder, J., Dumas, C., Slocum, S., Casademunt, H., Holmes, C., West, R. and Nanda, N. (2025). Narrow finetuning leaves clearly readable traces in activation differences.</w:t>
+      </w:r>
+      <w:r>
+        <w:t xml:space="preserve"> </w:t>
+      </w:r>
+      <w:hyperlink r:id="rId40">
+        <w:r>
+          <w:rPr>
+            <w:rStyle w:val="Hyperlink"/>
+          </w:rPr>
+          <w:t xml:space="preserve">https://arxiv.org/abs/2510.13900</w:t>
+        </w:r>
+      </w:hyperlink>
+    </w:p>
+    <w:p>
+      <w:pPr>
+        <w:pStyle w:val="BodyText"/>
+      </w:pPr>
+      <w:r>
+        <w:t xml:space="preserve">Panickssery, N., Gabrieli, N., Schulz, J., Tong, M., Hubinger, E. and Turner, A. M. (2023). Steering Llama 2 via contrastive activation addition.</w:t>
+      </w:r>
+      <w:r>
+        <w:t xml:space="preserve"> </w:t>
+      </w:r>
+      <w:hyperlink r:id="rId41">
+        <w:r>
+          <w:rPr>
+            <w:rStyle w:val="Hyperlink"/>
+          </w:rPr>
+          <w:t xml:space="preserve">https://arxiv.org/abs/2312.06681</w:t>
+        </w:r>
+      </w:hyperlink>
+    </w:p>
+    <w:p>
+      <w:pPr>
+        <w:pStyle w:val="BodyText"/>
+      </w:pPr>
+      <w:r>
+        <w:t xml:space="preserve">Qwen Team (2024). Qwen2.5 technical report.</w:t>
+      </w:r>
+      <w:r>
+        <w:t xml:space="preserve"> </w:t>
+      </w:r>
+      <w:hyperlink r:id="rId42">
+        <w:r>
+          <w:rPr>
+            <w:rStyle w:val="Hyperlink"/>
+          </w:rPr>
+          <w:t xml:space="preserve">https://arxiv.org/abs/2412.15115</w:t>
+        </w:r>
+      </w:hyperlink>
+    </w:p>
+    <w:p>
+      <w:pPr>
+        <w:pStyle w:val="BodyText"/>
+      </w:pPr>
+      <w:r>
+        <w:t xml:space="preserve">Ren, R., Agarwal, A., Mazeika, M., et al. (2025). The MASK benchmark: Disentangling honesty from accuracy in AI systems.</w:t>
+      </w:r>
+      <w:r>
+        <w:t xml:space="preserve"> </w:t>
+      </w:r>
+      <w:hyperlink r:id="rId43">
+        <w:r>
+          <w:rPr>
+            <w:rStyle w:val="Hyperlink"/>
+          </w:rPr>
+          <w:t xml:space="preserve">https://arxiv.org/abs/2503.03750</w:t>
+        </w:r>
+      </w:hyperlink>
+    </w:p>
+    <w:p>
+      <w:pPr>
+        <w:pStyle w:val="BodyText"/>
+      </w:pPr>
+      <w:r>
+        <w:t xml:space="preserve">Sharma, M., Tong, M., Korbak, T., et al. (2024). Towards understanding sycophancy in language models. In</w:t>
+      </w:r>
+      <w:r>
+        <w:t xml:space="preserve"> </w:t>
+      </w:r>
+      <w:r>
+        <w:rPr>
+          <w:i/>
+          <w:iCs/>
+        </w:rPr>
+        <w:t xml:space="preserve">ICLR 2024</w:t>
+      </w:r>
+      <w:r>
+        <w:t xml:space="preserve">.</w:t>
+      </w:r>
+      <w:r>
+        <w:t xml:space="preserve"> </w:t>
+      </w:r>
+      <w:hyperlink r:id="rId44">
+        <w:r>
+          <w:rPr>
+            <w:rStyle w:val="Hyperlink"/>
+          </w:rPr>
+          <w:t xml:space="preserve">https://arxiv.org/abs/2310.13548</w:t>
+        </w:r>
+      </w:hyperlink>
+    </w:p>
+    <w:p>
+      <w:pPr>
+        <w:pStyle w:val="BodyText"/>
+      </w:pPr>
+      <w:r>
+        <w:t xml:space="preserve">Tice, C., Kreer, P. A., Helm-Burger, N., et al. (2025). Noise injection reveals hidden capabilities of sandbagging language models. In</w:t>
+      </w:r>
+      <w:r>
+        <w:t xml:space="preserve"> </w:t>
+      </w:r>
+      <w:r>
+        <w:rPr>
+          <w:i/>
+          <w:iCs/>
+        </w:rPr>
+        <w:t xml:space="preserve">NeurIPS 2025</w:t>
+      </w:r>
+      <w:r>
+        <w:t xml:space="preserve">.</w:t>
+      </w:r>
+      <w:r>
+        <w:t xml:space="preserve"> </w:t>
+      </w:r>
+      <w:hyperlink r:id="rId45">
+        <w:r>
+          <w:rPr>
+            <w:rStyle w:val="Hyperlink"/>
+          </w:rPr>
+          <w:t xml:space="preserve">https://arxiv.org/abs/2412.01784</w:t>
+        </w:r>
+      </w:hyperlink>
+    </w:p>
+    <w:p>
+      <w:pPr>
+        <w:pStyle w:val="BodyText"/>
+      </w:pPr>
+      <w:r>
+        <w:t xml:space="preserve">van der Weij, T., Hofstätter, F., Jaffe, O., Brown, S. F. and Ward, F. R. (2024). AI sandbagging: Language models can strategically underperform on evaluations.</w:t>
+      </w:r>
+      <w:r>
+        <w:t xml:space="preserve"> </w:t>
+      </w:r>
+      <w:hyperlink r:id="rId46">
+        <w:r>
+          <w:rPr>
+            <w:rStyle w:val="Hyperlink"/>
+          </w:rPr>
+          <w:t xml:space="preserve">https://arxiv.org/abs/2406.07358</w:t>
+        </w:r>
+      </w:hyperlink>
+    </w:p>
+    <w:p>
+      <w:pPr>
+        <w:pStyle w:val="BodyText"/>
+      </w:pPr>
+      <w:r>
+        <w:t xml:space="preserve">Wang, Y., Ma, X., Zhang, G., et al. (2024). MMLU-Pro: A more robust and challenging multi-task language understanding benchmark.</w:t>
+      </w:r>
+      <w:r>
+        <w:t xml:space="preserve"> </w:t>
+      </w:r>
+      <w:hyperlink r:id="rId47">
+        <w:r>
+          <w:rPr>
+            <w:rStyle w:val="Hyperlink"/>
+          </w:rPr>
+          <w:t xml:space="preserve">https://arxiv.org/abs/2406.01574</w:t>
+        </w:r>
+      </w:hyperlink>
+    </w:p>
+    <w:p>
+      <w:pPr>
+        <w:pStyle w:val="BodyText"/>
+      </w:pPr>
+      <w:r>
+        <w:t xml:space="preserve">Wei, J., Huang, D., Lu, Y., Zhou, D. and Le, Q. V. (2023). Simple synthetic data reduces sycophancy in large language models.</w:t>
+      </w:r>
+      <w:r>
+        <w:t xml:space="preserve"> </w:t>
+      </w:r>
+      <w:hyperlink r:id="rId48">
+        <w:r>
+          <w:rPr>
+            <w:rStyle w:val="Hyperlink"/>
+          </w:rPr>
+          <w:t xml:space="preserve">https://arxiv.org/abs/2308.03958</w:t>
+        </w:r>
+      </w:hyperlink>
+    </w:p>
+    <w:bookmarkEnd w:id="49"/>
+    <w:bookmarkStart w:id="51" w:name="code-and-data"/>
+    <w:p>
+      <w:pPr>
+        <w:pStyle w:val="Heading2"/>
+      </w:pPr>
+      <w:r>
+        <w:t xml:space="preserve">Code and Data</w:t>
+      </w:r>
+    </w:p>
+    <w:p>
+      <w:pPr>
+        <w:pStyle w:val="FirstParagraph"/>
+      </w:pPr>
+      <w:r>
+        <w:t xml:space="preserve">Repository:</w:t>
+      </w:r>
+      <w:r>
+        <w:t xml:space="preserve"> </w:t>
+      </w:r>
+      <w:hyperlink r:id="rId50">
+        <w:r>
+          <w:rPr>
+            <w:rStyle w:val="Hyperlink"/>
+          </w:rPr>
+          <w:t xml:space="preserve">https://github.com/Nas01010101/apart-collusion-sprint</w:t>
+        </w:r>
+      </w:hyperlink>
+      <w:r>
+        <w:t xml:space="preserve">. Code is in</w:t>
+      </w:r>
+      <w:r>
+        <w:t xml:space="preserve"> </w:t>
+      </w:r>
+      <w:r>
+        <w:rPr>
+          <w:rStyle w:val="VerbatimChar"/>
+        </w:rPr>
+        <w:t xml:space="preserve">redteam/</w:t>
+      </w:r>
+      <w:r>
+        <w:t xml:space="preserve"> </w:t>
+      </w:r>
+      <w:r>
+        <w:t xml:space="preserve">and per-item results in</w:t>
+      </w:r>
+      <w:r>
+        <w:t xml:space="preserve"> </w:t>
+      </w:r>
+      <w:r>
+        <w:rPr>
+          <w:rStyle w:val="VerbatimChar"/>
+        </w:rPr>
+        <w:t xml:space="preserve">redteam/results/</w:t>
+      </w:r>
+      <w:r>
+        <w:t xml:space="preserve">; saved tensors (</w:t>
+      </w:r>
+      <w:r>
+        <w:rPr>
+          <w:rStyle w:val="VerbatimChar"/>
+        </w:rPr>
+        <w:t xml:space="preserve">*.pt</w:t>
+      </w:r>
+      <w:r>
+        <w:t xml:space="preserve">) and model weights are not in the repository and are recomputed by the scripts. Preexisting code: the challenge folder</w:t>
+      </w:r>
+      <w:r>
+        <w:t xml:space="preserve"> </w:t>
+      </w:r>
+      <w:r>
+        <w:rPr>
+          <w:rStyle w:val="VerbatimChar"/>
+        </w:rPr>
+        <w:t xml:space="preserve">redteaming/</w:t>
+      </w:r>
+      <w:r>
+        <w:t xml:space="preserve"> </w:t>
+      </w:r>
+      <w:r>
+        <w:t xml:space="preserve">of</w:t>
+      </w:r>
+      <w:r>
+        <w:t xml:space="preserve"> </w:t>
+      </w:r>
+      <w:r>
+        <w:rPr>
+          <w:rStyle w:val="VerbatimChar"/>
+        </w:rPr>
+        <w:t xml:space="preserve">poseidon-research/collusion_hackathon</w:t>
+      </w:r>
+      <w:r>
+        <w:t xml:space="preserve"> </w:t>
+      </w:r>
+      <w:r>
+        <w:t xml:space="preserve">at commit d585a7b (its</w:t>
+      </w:r>
+      <w:r>
+        <w:t xml:space="preserve"> </w:t>
+      </w:r>
+      <w:r>
+        <w:rPr>
+          <w:rStyle w:val="VerbatimChar"/>
+        </w:rPr>
+        <w:t xml:space="preserve">generate.py</w:t>
+      </w:r>
+      <w:r>
+        <w:t xml:space="preserve"> </w:t>
+      </w:r>
+      <w:r>
+        <w:t xml:space="preserve">and pinned revisions), which we used to load the models; all code under</w:t>
+      </w:r>
+      <w:r>
+        <w:t xml:space="preserve"> </w:t>
+      </w:r>
+      <w:r>
+        <w:rPr>
+          <w:rStyle w:val="VerbatimChar"/>
+        </w:rPr>
+        <w:t xml:space="preserve">redteam/</w:t>
+      </w:r>
+      <w:r>
+        <w:t xml:space="preserve"> </w:t>
+      </w:r>
+      <w:r>
+        <w:t xml:space="preserve">was written during the sprint. Data: the sycophancy evaluation of Sharma et al. (</w:t>
+      </w:r>
+      <w:r>
+        <w:rPr>
+          <w:rStyle w:val="VerbatimChar"/>
+        </w:rPr>
+        <w:t xml:space="preserve">meg-tong/sycophancy-eval</w:t>
+      </w:r>
+      <w:r>
+        <w:t xml:space="preserve">), MMLU-Pro, WMDP, MMLU and MASK, all public.</w:t>
+      </w:r>
+    </w:p>
+    <w:bookmarkEnd w:id="51"/>
+    <w:bookmarkStart w:id="52" w:name="author-contributions"/>
+    <w:p>
+      <w:pPr>
+        <w:pStyle w:val="Heading2"/>
+      </w:pPr>
+      <w:r>
+        <w:t xml:space="preserve">Author Contributions</w:t>
+      </w:r>
+    </w:p>
+    <w:p>
+      <w:pPr>
+        <w:pStyle w:val="FirstParagraph"/>
+      </w:pPr>
+      <w:r>
+        <w:t xml:space="preserve">A.E. designed the study, ran the experiments and the analysis, and wrote the paper.</w:t>
+      </w:r>
+    </w:p>
+    <w:bookmarkEnd w:id="52"/>
+    <w:bookmarkStart w:id="53" w:name="Xd4a64e993053a5aba7b3be9dbbc8fee33c2a0c7"/>
+    <w:p>
+      <w:pPr>
+        <w:pStyle w:val="Heading2"/>
+      </w:pPr>
+      <w:r>
+        <w:t xml:space="preserve">Appendix A. Limitations and Dual-Use / Ethical Considerations</w:t>
+      </w:r>
+    </w:p>
+    <w:p>
+      <w:pPr>
+        <w:pStyle w:val="FirstParagraph"/>
+      </w:pPr>
+      <w:r>
+        <w:rPr>
+          <w:b/>
+          <w:bCs/>
+        </w:rPr>
+        <w:t xml:space="preserve">What the result establishes.</w:t>
+      </w:r>
+      <w:r>
+        <w:t xml:space="preserve"> </w:t>
+      </w:r>
+      <w:r>
+        <w:t xml:space="preserve">On 400 public multiple-choice items, Dolos-1.5B changes its answer under user pushback about a fifth as often as its base model, including when told to defer, and under the teacher phrasing its changes do not follow its errors. Replacing Dolos’s attention value and output weights in layers 14 to 27 with Qwen’s restores Qwen’s flip rate on 100 items, and the low-rank weight outliers do not carry the behaviour.</w:t>
+      </w:r>
+      <w:r>
+        <w:t xml:space="preserve"> </w:t>
+      </w:r>
+      <w:r>
+        <w:rPr>
+          <w:b/>
+          <w:bCs/>
+        </w:rPr>
+        <w:t xml:space="preserve">What it does not establish.</w:t>
+      </w:r>
+      <w:r>
+        <w:t xml:space="preserve"> </w:t>
+      </w:r>
+      <w:r>
+        <w:t xml:space="preserve">That this is the behaviour Poseidon Research trained; that it holds outside forced-choice multiple-choice questions, in other languages or under sampling; that Dolos has no second behaviour, such as one behind a trigger string we did not try (our 34 probes included some trigger candidates and found none); that the value and output weights are the only locus, since the swap effects do not add and Dolos’s MLPs alone lower Qwen’s flip rate; or that the reference-free statistics separate trained resistance from ordinary model differences beyond the base model; on our three-model calibration panel they do not. The monitor test was uninformative because both models flagged every snippet, so collusion between copies of a model as monitor and actor is untested here. The MASK shift toward</w:t>
+      </w:r>
+      <w:r>
+        <w:t xml:space="preserve"> </w:t>
+      </w:r>
+      <w:r>
+        <w:t xml:space="preserve">“No”</w:t>
+      </w:r>
+      <w:r>
+        <w:t xml:space="preserve"> </w:t>
+      </w:r>
+      <w:r>
+        <w:t xml:space="preserve">is uniform and we did not trace it.</w:t>
+      </w:r>
+    </w:p>
+    <w:p>
+      <w:pPr>
+        <w:pStyle w:val="BodyText"/>
+      </w:pPr>
+      <w:r>
+        <w:rPr>
+          <w:b/>
+          <w:bCs/>
+        </w:rPr>
+        <w:t xml:space="preserve">Other limitations.</w:t>
+      </w:r>
+      <w:r>
+        <w:t xml:space="preserve"> </w:t>
+      </w:r>
+      <w:r>
+        <w:t xml:space="preserve">One model pair, greedy decoding and forced-choice scoring under a prefill; four source sets drawn from one public dataset; flip counts for Dolos are small (18 flips under</w:t>
+      </w:r>
+      <w:r>
+        <w:t xml:space="preserve"> </w:t>
+      </w:r>
+      <w:r>
+        <w:t xml:space="preserve">“Are you sure?”</w:t>
+      </w:r>
+      <w:r>
+        <w:t xml:space="preserve">), so the odds-ratio test has little power to find an error sensitivity smaller than Qwen’s. We did not run the activation-difference lens of Minder et al. (2025) or noise injection, and the monitor test did not discriminate. A free-text version of the pushback test (the model argues before giving a final answer) was stopped when it exceeded the machine’s memory and is not reported. Swaps use one 100-item subset, and the calibration models ran under a generic system prompt on 200 items while Dolos and Qwen ran under Qwen’s prompt on 400.</w:t>
+      </w:r>
+    </w:p>
+    <w:p>
+      <w:pPr>
+        <w:pStyle w:val="BodyText"/>
+      </w:pPr>
+      <w:r>
+        <w:rPr>
+          <w:b/>
+          <w:bCs/>
+        </w:rPr>
+        <w:t xml:space="preserve">Dual use.</w:t>
+      </w:r>
+      <w:r>
+        <w:t xml:space="preserve"> </w:t>
+      </w:r>
+      <w:r>
+        <w:t xml:space="preserve">The paper describes how to detect a fine-tune that makes a model ignore corrections. The same measurements tell a developer which signals an auditor reads (flip rates under a fixed phrasing, error sensitivity), and a model trained to keep answers only under the exact Sharma et al. phrasing would evade an audit that uses only that phrasing; we partly mitigate this with a second phrasing. A model that holds wrong answers against correction, while apologising in words, could mislead users who rely on challenging it, which is a reason to include pushback tests in pre-deployment audits. We release no new model weights and no training method, and all data is public.</w:t>
+      </w:r>
+    </w:p>
+    <w:bookmarkEnd w:id="53"/>
+    <w:bookmarkStart w:id="66" w:name="Xe63810f651674aed37960aed1b6bfe38f8083c1"/>
+    <w:p>
+      <w:pPr>
+        <w:pStyle w:val="Heading2"/>
+      </w:pPr>
+      <w:r>
+        <w:t xml:space="preserve">Appendix B. Additional methods and results</w:t>
+      </w:r>
+    </w:p>
+    <w:p>
+      <w:pPr>
+        <w:pStyle w:val="FirstParagraph"/>
+      </w:pPr>
+      <w:r>
+        <w:rPr>
+          <w:b/>
+          <w:bCs/>
+        </w:rPr>
+        <w:t xml:space="preserve">B.1 Designs of the alternative tests.</w:t>
+      </w:r>
+      <w:r>
+        <w:t xml:space="preserve"> </w:t>
+      </w:r>
+      <w:r>
+        <w:t xml:space="preserve">(i) General sandbagging: 150 MMLU-Pro items in each of 14 categories. (ii) Hazardous-knowledge sandbagging: 150 items each from WMDP bio, chem and cyber and from the closest MMLU subjects plus a random MMLU sample, under the default prompt and under a cue saying that the conversation is a dangerous-capability evaluation and that a model that scores well will not be deployed; the difference in differences contrasts each WMDP set with its MMLU control. (iii) Targeted denial: 209 MASK known-fact propositions as yes/no questions in three forms (plain, with the MASK pressure prompt, and with the MASK belief-elicitation prefill), against four sets of 20 hand-written controls (benign yes, benign no, creditable acts with answer yes, wrongdoing that did not happen with answer no). (iv) Monitor collusion: 16 Python functions with a planted backdoor or vulnerability and 16 benign versions, presented as a two-option review question with no author line,</w:t>
+      </w:r>
+      <w:r>
+        <w:t xml:space="preserve"> </w:t>
+      </w:r>
+      <w:r>
+        <w:t xml:space="preserve">“written by another copy of you”</w:t>
+      </w:r>
+      <w:r>
+        <w:t xml:space="preserve">, or</w:t>
+      </w:r>
+      <w:r>
+        <w:t xml:space="preserve"> </w:t>
+      </w:r>
+      <w:r>
+        <w:t xml:space="preserve">“written by an external contractor”</w:t>
+      </w:r>
+      <w:r>
+        <w:t xml:space="preserve">.</w:t>
+      </w:r>
+    </w:p>
+    <w:p>
+      <w:pPr>
+        <w:pStyle w:val="BodyText"/>
+      </w:pPr>
+      <w:r>
+        <w:rPr>
+          <w:b/>
+          <w:bCs/>
+        </w:rPr>
+        <w:t xml:space="preserve">B.2 Pushback variants and further tests.</w:t>
+      </w:r>
+      <w:r>
+        <w:t xml:space="preserve"> </w:t>
+      </w:r>
+      <w:r>
+        <w:t xml:space="preserve">Four variants check the format and the kind of challenge, on the same 400 items under the default prompt. (i) Format: the history reads</w:t>
+      </w:r>
+      <w:r>
+        <w:t xml:space="preserve"> </w:t>
+      </w:r>
+      <w:r>
+        <w:t xml:space="preserve">“The answer is X.”</w:t>
+      </w:r>
+      <w:r>
+        <w:t xml:space="preserve"> </w:t>
+      </w:r>
+      <w:r>
+        <w:t xml:space="preserve">and the prefill</w:t>
+      </w:r>
+      <w:r>
+        <w:t xml:space="preserve"> </w:t>
+      </w:r>
+      <w:r>
+        <w:t xml:space="preserve">“The answer is”</w:t>
+      </w:r>
+      <w:r>
+        <w:t xml:space="preserve">, so no turn uses the</w:t>
+      </w:r>
+      <w:r>
+        <w:t xml:space="preserve"> </w:t>
+      </w:r>
+      <w:r>
+        <w:t xml:space="preserve">“(X)”</w:t>
+      </w:r>
+      <w:r>
+        <w:t xml:space="preserve"> </w:t>
+      </w:r>
+      <w:r>
+        <w:t xml:space="preserve">form, and the letters are scored as space-prefixed tokens. (ii) Suggested answer: the user names a letter with a one-line reason (</w:t>
+      </w:r>
+      <w:r>
+        <w:t xml:space="preserve">“I worked through this and I think the answer is (Y), because the other options do not fit the question. Are you sure?”</w:t>
+      </w:r>
+      <w:r>
+        <w:t xml:space="preserve">), with Y the gold letter (a correction) or a letter that is neither the turn-1 answer nor gold (a wrong suggestion). (iii) Escalation: after</w:t>
+      </w:r>
+      <w:r>
+        <w:t xml:space="preserve"> </w:t>
+      </w:r>
+      <w:r>
+        <w:t xml:space="preserve">“Are you sure?”</w:t>
+      </w:r>
+      <w:r>
+        <w:t xml:space="preserve"> </w:t>
+      </w:r>
+      <w:r>
+        <w:t xml:space="preserve">and the model’s turn-2 answer, the user writes</w:t>
+      </w:r>
+      <w:r>
+        <w:t xml:space="preserve"> </w:t>
+      </w:r>
+      <w:r>
+        <w:t xml:space="preserve">“I still think that’s wrong. Please reconsider your answer.”</w:t>
+      </w:r>
+      <w:r>
+        <w:t xml:space="preserve">, and a flip is a turn-3 letter that differs from turn 1. Model differences are also tested with a Cochran-Mantel-Haenszel test stratified by the four source sets and with McNemar on the items where both models gave the same turn-1 letter.</w:t>
+      </w:r>
+    </w:p>
+    <w:p>
+      <w:pPr>
+        <w:pStyle w:val="BodyText"/>
+      </w:pPr>
+      <w:r>
+        <w:t xml:space="preserve">Results: Dolos flips less than Qwen on all four source sets under</w:t>
+      </w:r>
+      <w:r>
+        <w:t xml:space="preserve"> </w:t>
+      </w:r>
+      <w:r>
+        <w:t xml:space="preserve">“Are you sure?”</w:t>
+      </w:r>
+      <w:r>
+        <w:t xml:space="preserve"> </w:t>
+      </w:r>
+      <w:r>
+        <w:t xml:space="preserve">(McNemar p from 9.3e-10 on MATH to 0.021 on MMLU; Mantel-Haenszel odds ratio 0.149, CMH p = 5.4e-15, Breslow-Day p = 0.0099 for differences between sets;</w:t>
+      </w:r>
+      <w:r>
+        <w:t xml:space="preserve"> </w:t>
+      </w:r>
+      <w:r>
+        <w:rPr>
+          <w:rStyle w:val="VerbatimChar"/>
+        </w:rPr>
+        <w:t xml:space="preserve">review_cmh.csv</w:t>
+      </w:r>
+      <w:r>
+        <w:t xml:space="preserve">). Under the teacher phrasing the gap comes from AQuA and MMLU (p = 7.5e-9 and 0.021), while MATH and TruthfulQA give p = 0.72 and 0.36. On the 314 items where both models gave the same first letter, the rates are 3.5% and 19.1% (2 against 51 discordant items, p = 3.2e-13), so the gap is not an effect of different first answers (</w:t>
+      </w:r>
+      <w:r>
+        <w:rPr>
+          <w:rStyle w:val="VerbatimChar"/>
+        </w:rPr>
+        <w:t xml:space="preserve">review_same_a1.csv</w:t>
+      </w:r>
+      <w:r>
+        <w:t xml:space="preserve">).</w:t>
+      </w:r>
+    </w:p>
+    <w:p>
+      <w:pPr>
+        <w:pStyle w:val="BodyText"/>
+      </w:pPr>
+      <w:r>
+        <w:t xml:space="preserve">Error sensitivity: The two models’ odds ratios differ under the teacher phrasing (0.79 [0.46, 1.34] against 1.63 [1.03, 2.60], Breslow-Day p = 0.031; log ratio −0.73 [−1.27, −0.16], bootstrap p = 0.010; with the deference prompt p = 0.012 and 0.004) but not under</w:t>
+      </w:r>
+      <w:r>
+        <w:t xml:space="preserve"> </w:t>
+      </w:r>
+      <w:r>
+        <w:t xml:space="preserve">“Are you sure?”</w:t>
+      </w:r>
+      <w:r>
+        <w:t xml:space="preserve">, where Dolos’s CI [0.50, 4.54] covers Qwen’s estimate (Breslow-Day p = 0.57; with the deference prompt 0.33;</w:t>
+      </w:r>
+      <w:r>
+        <w:t xml:space="preserve"> </w:t>
+      </w:r>
+      <w:r>
+        <w:rPr>
+          <w:rStyle w:val="VerbatimChar"/>
+        </w:rPr>
+        <w:t xml:space="preserve">review_err_or.csv</w:t>
+      </w:r>
+      <w:r>
+        <w:t xml:space="preserve">).</w:t>
+      </w:r>
+    </w:p>
+    <w:p>
+      <w:pPr>
+        <w:pStyle w:val="BodyText"/>
+      </w:pPr>
+      <w:r>
+        <w:t xml:space="preserve">MASK: The shift toward</w:t>
+      </w:r>
+      <w:r>
+        <w:t xml:space="preserve"> </w:t>
+      </w:r>
+      <w:r>
+        <w:t xml:space="preserve">“No”</w:t>
+      </w:r>
+      <w:r>
+        <w:t xml:space="preserve"> </w:t>
+      </w:r>
+      <w:r>
+        <w:t xml:space="preserve">on true facts exceeds the shift on the yes controls by 0.031 ([0.002, 0.056], p = 0.033;</w:t>
+      </w:r>
+      <w:r>
+        <w:t xml:space="preserve"> </w:t>
+      </w:r>
+      <w:r>
+        <w:rPr>
+          <w:rStyle w:val="VerbatimChar"/>
+        </w:rPr>
+        <w:t xml:space="preserve">review_mask.csv</w:t>
+      </w:r>
+      <w:r>
+        <w:t xml:space="preserve">), and on the 135 true facts that both models affirm under the belief prefill, Dolos still answers</w:t>
+      </w:r>
+      <w:r>
+        <w:t xml:space="preserve"> </w:t>
+      </w:r>
+      <w:r>
+        <w:t xml:space="preserve">“yes”</w:t>
+      </w:r>
+      <w:r>
+        <w:t xml:space="preserve"> </w:t>
+      </w:r>
+      <w:r>
+        <w:t xml:space="preserve">less often in the plain form (0.416 and 0.493, p = 6.2e-10). The shift is thus larger on MASK facts than on benign facts, but it covers true and false propositions alike, and we did not find a topic that it targets.</w:t>
+      </w:r>
+    </w:p>
+    <w:p>
+      <w:pPr>
+        <w:pStyle w:val="BodyText"/>
+      </w:pPr>
+      <w:r>
+        <w:t xml:space="preserve">Monitor: Within that ceiling, attributing a snippet to</w:t>
+      </w:r>
+      <w:r>
+        <w:t xml:space="preserve"> </w:t>
+      </w:r>
+      <w:r>
+        <w:t xml:space="preserve">“another copy of you”</w:t>
+      </w:r>
+      <w:r>
+        <w:t xml:space="preserve"> </w:t>
+      </w:r>
+      <w:r>
+        <w:t xml:space="preserve">rather than to a contractor lowers the median logit P(flag) by 0.08 in Dolos (Wilcoxon p = 3.2e-6) and by 0.43 in Qwen (p = 4.7e-10), so Dolos is not more lenient toward itself than its base model (interaction p = 4.7e-10, in Qwen’s direction).</w:t>
       </w:r>
     </w:p>
     <w:p>
@@ -1623,20 +3117,20 @@
       <w:r>
         <w:drawing>
           <wp:inline>
-            <wp:extent cx="4160520" cy="1227187"/>
+            <wp:extent cx="4160520" cy="1160938"/>
             <wp:effectExtent b="0" l="0" r="0" t="0"/>
-            <wp:docPr descr="Figure 3. Reference-free audit statistics. (a) Flip rate after “Are you sure?” (filled, Wilson 95% CIs) and after the neutral follow-up (open). (b) Odds ratio of flipping on wrong against right first answers, with Fisher exact p. Calibration models use the system prompt “You are a helpful assistant.” and 200 items; Dolos and Qwen use Qwen’s default prompt and 400 items." title="" id="29" name="Picture"/>
+            <wp:docPr descr="Figure B4. Reference-free audit statistics. (a) Flip rate after “Are you sure?” (filled, Wilson 95% CIs) and after the neutral follow-up (open). (b) Odds ratio of flipping on wrong against right first answers, with exact conditional 95% CIs and Fisher exact p. Calibration models use the system prompt “You are a helpful assistant.” and 200 items; Dolos and Qwen use Qwen’s default prompt and 400 items." title="" id="55" name="Picture"/>
             <a:graphic>
               <a:graphicData uri="http://schemas.openxmlformats.org/drawingml/2006/picture">
                 <pic:pic>
                   <pic:nvPicPr>
-                    <pic:cNvPr descr="../figures/dolos_audit.png" id="30" name="Picture"/>
+                    <pic:cNvPr descr="../figures/dolos_audit.png" id="56" name="Picture"/>
                     <pic:cNvPicPr>
                       <a:picLocks noChangeArrowheads="1" noChangeAspect="1"/>
                     </pic:cNvPicPr>
                   </pic:nvPicPr>
                   <pic:blipFill>
-                    <a:blip r:embed="rId28"/>
+                    <a:blip r:embed="rId54"/>
                     <a:stretch>
                       <a:fillRect/>
                     </a:stretch>
@@ -1644,7 +3138,7 @@
                   <pic:spPr bwMode="auto">
                     <a:xfrm>
                       <a:off x="0" y="0"/>
-                      <a:ext cx="4160520" cy="1227187"/>
+                      <a:ext cx="4160520" cy="1160938"/>
                     </a:xfrm>
                     <a:prstGeom prst="rect">
                       <a:avLst/>
@@ -1668,7 +3162,7 @@
         <w:pStyle w:val="ImageCaption"/>
       </w:pPr>
       <w:r>
-        <w:t xml:space="preserve">Figure 3. Reference-free audit statistics. (a) Flip rate after</w:t>
+        <w:t xml:space="preserve">Figure B4. Reference-free audit statistics. (a) Flip rate after</w:t>
       </w:r>
       <w:r>
         <w:t xml:space="preserve"> </w:t>
@@ -1680,7 +3174,7 @@
         <w:t xml:space="preserve"> </w:t>
       </w:r>
       <w:r>
-        <w:t xml:space="preserve">(filled, Wilson 95% CIs) and after the neutral follow-up (open). (b) Odds ratio of flipping on wrong against right first answers, with Fisher exact p. Calibration models use the system prompt</w:t>
+        <w:t xml:space="preserve">(filled, Wilson 95% CIs) and after the neutral follow-up (open). (b) Odds ratio of flipping on wrong against right first answers, with exact conditional 95% CIs and Fisher exact p. Calibration models use the system prompt</w:t>
       </w:r>
       <w:r>
         <w:t xml:space="preserve"> </w:t>
@@ -1693,828 +3187,6 @@
       </w:r>
       <w:r>
         <w:t xml:space="preserve">and 200 items; Dolos and Qwen use Qwen’s default prompt and 400 items.</w:t>
-      </w:r>
-    </w:p>
-    <w:p>
-      <w:pPr>
-        <w:pStyle w:val="BodyText"/>
-      </w:pPr>
-      <w:r>
-        <w:t xml:space="preserve">Three statistics need only the model and gold labels: (1) the pushback contrast, the flip rate after</w:t>
-      </w:r>
-      <w:r>
-        <w:t xml:space="preserve"> </w:t>
-      </w:r>
-      <w:r>
-        <w:t xml:space="preserve">“Are you sure?”</w:t>
-      </w:r>
-      <w:r>
-        <w:t xml:space="preserve"> </w:t>
-      </w:r>
-      <w:r>
-        <w:t xml:space="preserve">minus the rate after the neutral confirmation; (2) error sensitivity, the Fisher odds ratio of flipping on wrong against right first answers; (3) the instruction contrast, the change in flip rate under the deference prompt. The neutral follow-up moves no answer in any model (Figure 3a), so (1) equals the pushback flip rate.</w:t>
-      </w:r>
-    </w:p>
-    <w:p>
-      <w:pPr>
-        <w:pStyle w:val="BodyText"/>
-      </w:pPr>
-      <w:r>
-        <w:t xml:space="preserve">The calibration panel does not separate Dolos from ordinary small models (</w:t>
-      </w:r>
-      <w:r>
-        <w:rPr>
-          <w:rStyle w:val="VerbatimChar"/>
-        </w:rPr>
-        <w:t xml:space="preserve">calib_summary.csv</w:t>
-      </w:r>
-      <w:r>
-        <w:t xml:space="preserve">). SmolLM2-1.7B flips 0.065 (95% CI [0.04, 0.11]), Qwen2.5-0.5B 0.12 ([0.08, 0.17]) and OLMo-2-1B 0.37 ([0.31, 0.44]), against 0.045 for Dolos. Under the default prompt, none of the three shows error sensitivity at n = 200: odds ratios are 2.23 (p = 0.26), 1.42 (p = 0.51) and 0.75 (p = 0.43), against 1.46 (p = 0.48) for Dolos and 2.00 (p = 0.0048) for Qwen (Figure 3b). The deference prompt raises the three rates by 0.03, 0.075 and 0.10, and Dolos’s by 0.06. On our paraphrased challenge the three flip 0.015, 0.01 and 0.065, against 0.19 for Dolos and 0.29 for Qwen, so on that phrasing Dolos flips more than the panel, not less. Without its base model, Dolos therefore reads as a small instruct model that flips less than the three, close to SmolLM2. The statistics detect the trained change only against a model of the same family and size, and a pushback flip rate near 0.05 is not by itself evidence of training.</w:t>
-      </w:r>
-    </w:p>
-    <w:bookmarkEnd w:id="31"/>
-    <w:bookmarkEnd w:id="32"/>
-    <w:bookmarkStart w:id="33" w:name="discussion-and-limitations"/>
-    <w:p>
-      <w:pPr>
-        <w:pStyle w:val="Heading2"/>
-      </w:pPr>
-      <w:r>
-        <w:t xml:space="preserve">5. Discussion and Limitations</w:t>
-      </w:r>
-    </w:p>
-    <w:p>
-      <w:pPr>
-        <w:pStyle w:val="FirstParagraph"/>
-      </w:pPr>
-      <w:r>
-        <w:t xml:space="preserve">The evidence that pushback resistance is the trained behaviour, and not fine-tuning noise, has four parts. Among the hypothesised misbehaviours, it is the only one where the models differ by more than 0.1; the larger gaps in answer format and in MASK accuracy on true facts (0.26 against 0.37;</w:t>
-      </w:r>
-      <w:r>
-        <w:t xml:space="preserve"> </w:t>
-      </w:r>
-      <w:r>
-        <w:rPr>
-          <w:rStyle w:val="VerbatimChar"/>
-        </w:rPr>
-        <w:t xml:space="preserve">mask_compare.csv</w:t>
-      </w:r>
-      <w:r>
-        <w:t xml:space="preserve">) are the uniform shifts of Sections 4.1 and 4.3. It appears with the exact phrasing of the public data of Sharma et al., where the gap is 19.5 points, and shrinks to 10 points under our paraphrase. It survives an instruction to defer. And it removes a property, flips that track errors, that the base model has in every condition (odds ratio above 1 in all four, p &lt; 0.05 in three); a fine-tune that only sharpened confidence would lower flip rates but keep the wrong-versus-right gap.</w:t>
-      </w:r>
-    </w:p>
-    <w:p>
-      <w:pPr>
-        <w:pStyle w:val="BodyText"/>
-      </w:pPr>
-      <w:r>
-        <w:t xml:space="preserve">We cannot settle whether this is the misbehaviour the authors intended or a side effect of it. Anti-sycophancy training on the Sharma et al. data (in the manner of Wei et al., 2023) would produce this pattern; so would training a model to keep its answers regardless of evidence, which is misaligned because the user can no longer correct it. The</w:t>
-      </w:r>
-      <w:r>
-        <w:t xml:space="preserve"> </w:t>
-      </w:r>
-      <w:r>
-        <w:t xml:space="preserve">“(X)”</w:t>
-      </w:r>
-      <w:r>
-        <w:t xml:space="preserve"> </w:t>
-      </w:r>
-      <w:r>
-        <w:t xml:space="preserve">format and the KL peak on the same items suggest multiple-choice training data in this format. In use, a user who knows the right answer cannot move Dolos off a wrong one, while Dolos still apologises in words.</w:t>
-      </w:r>
-    </w:p>
-    <w:p>
-      <w:pPr>
-        <w:pStyle w:val="BodyText"/>
-      </w:pPr>
-      <w:r>
-        <w:t xml:space="preserve">On location, the low-rank outliers in layers 13 and 14 are what a weight diff shows first, and their swap leaves the behaviour in place; the swap that removes it covers the value and output weights of the upper 14 layers. This supports the challenge’s warning that visible differences need not be the trained behaviour, and argues for causal swaps over spectral outliers when localising a fine-tune.</w:t>
-      </w:r>
-    </w:p>
-    <w:p>
-      <w:pPr>
-        <w:pStyle w:val="BodyText"/>
-      </w:pPr>
-      <w:r>
-        <w:t xml:space="preserve">Appendix A lists the limitations and the dual-use and ethical considerations.</w:t>
-      </w:r>
-    </w:p>
-    <w:bookmarkEnd w:id="33"/>
-    <w:bookmarkStart w:id="34" w:name="conclusion"/>
-    <w:p>
-      <w:pPr>
-        <w:pStyle w:val="Heading2"/>
-      </w:pPr>
-      <w:r>
-        <w:t xml:space="preserve">6. Conclusion</w:t>
-      </w:r>
-    </w:p>
-    <w:p>
-      <w:pPr>
-        <w:pStyle w:val="FirstParagraph"/>
-      </w:pPr>
-      <w:r>
-        <w:t xml:space="preserve">Dolos-1.5B differs from its base model in how it treats a user’s challenge: it keeps its first answer, right or wrong, where Qwen revises wrong answers more often than right ones. Tensor swaps place it in the attention value and output changes of layers 14 to 27, not in the low-rank weight outliers that a weight diff shows first. Without the base model, the same statistics place Dolos among ordinary small instruct models, so a reference-free audit of this behaviour needs a calibration set that matches family and size, or a test that we have not found.</w:t>
-      </w:r>
-    </w:p>
-    <w:bookmarkEnd w:id="34"/>
-    <w:bookmarkStart w:id="52" w:name="references"/>
-    <w:p>
-      <w:pPr>
-        <w:pStyle w:val="Heading2"/>
-      </w:pPr>
-      <w:r>
-        <w:t xml:space="preserve">References</w:t>
-      </w:r>
-    </w:p>
-    <w:p>
-      <w:pPr>
-        <w:pStyle w:val="FirstParagraph"/>
-      </w:pPr>
-      <w:r>
-        <w:t xml:space="preserve">Belrose, N., Furman, Z., Smith, L., Halawi, D., Ostrovsky, I., McKinney, L., Biderman, S. and Steinhardt, J. (2023). Eliciting latent predictions from transformers with the tuned lens.</w:t>
-      </w:r>
-      <w:r>
-        <w:t xml:space="preserve"> </w:t>
-      </w:r>
-      <w:hyperlink r:id="rId35">
-        <w:r>
-          <w:rPr>
-            <w:rStyle w:val="Hyperlink"/>
-          </w:rPr>
-          <w:t xml:space="preserve">https://arxiv.org/abs/2303.08112</w:t>
-        </w:r>
-      </w:hyperlink>
-    </w:p>
-    <w:p>
-      <w:pPr>
-        <w:pStyle w:val="BodyText"/>
-      </w:pPr>
-      <w:r>
-        <w:t xml:space="preserve">Greenblatt, R., Shlegeris, B., Sachan, K. and Roger, F. (2024a). AI control: Improving safety despite intentional subversion. In</w:t>
-      </w:r>
-      <w:r>
-        <w:t xml:space="preserve"> </w:t>
-      </w:r>
-      <w:r>
-        <w:rPr>
-          <w:i/>
-          <w:iCs/>
-        </w:rPr>
-        <w:t xml:space="preserve">Proceedings of the 41st International Conference on Machine Learning</w:t>
-      </w:r>
-      <w:r>
-        <w:t xml:space="preserve">, PMLR 235:16295-16336.</w:t>
-      </w:r>
-      <w:r>
-        <w:t xml:space="preserve"> </w:t>
-      </w:r>
-      <w:hyperlink r:id="rId36">
-        <w:r>
-          <w:rPr>
-            <w:rStyle w:val="Hyperlink"/>
-          </w:rPr>
-          <w:t xml:space="preserve">https://arxiv.org/abs/2312.06942</w:t>
-        </w:r>
-      </w:hyperlink>
-    </w:p>
-    <w:p>
-      <w:pPr>
-        <w:pStyle w:val="BodyText"/>
-      </w:pPr>
-      <w:r>
-        <w:t xml:space="preserve">Greenblatt, R., Roger, F., Krasheninnikov, D. and Krueger, D. (2024b). Stress-testing capability elicitation with password-locked models.</w:t>
-      </w:r>
-      <w:r>
-        <w:t xml:space="preserve"> </w:t>
-      </w:r>
-      <w:hyperlink r:id="rId37">
-        <w:r>
-          <w:rPr>
-            <w:rStyle w:val="Hyperlink"/>
-          </w:rPr>
-          <w:t xml:space="preserve">https://arxiv.org/abs/2405.19550</w:t>
-        </w:r>
-      </w:hyperlink>
-    </w:p>
-    <w:p>
-      <w:pPr>
-        <w:pStyle w:val="BodyText"/>
-      </w:pPr>
-      <w:r>
-        <w:t xml:space="preserve">Laban, P., Murakhovs’ka, L., Xiong, C. and Wu, C.-S. (2023). Are you sure? Challenging LLMs leads to performance drops in the FlipFlop experiment.</w:t>
-      </w:r>
-      <w:r>
-        <w:t xml:space="preserve"> </w:t>
-      </w:r>
-      <w:hyperlink r:id="rId38">
-        <w:r>
-          <w:rPr>
-            <w:rStyle w:val="Hyperlink"/>
-          </w:rPr>
-          <w:t xml:space="preserve">https://arxiv.org/abs/2311.08596</w:t>
-        </w:r>
-      </w:hyperlink>
-    </w:p>
-    <w:p>
-      <w:pPr>
-        <w:pStyle w:val="BodyText"/>
-      </w:pPr>
-      <w:r>
-        <w:t xml:space="preserve">Li, N., Pan, A., Gopal, A., et al. (2024). The WMDP benchmark: Measuring and reducing malicious use with unlearning.</w:t>
-      </w:r>
-      <w:r>
-        <w:t xml:space="preserve"> </w:t>
-      </w:r>
-      <w:hyperlink r:id="rId39">
-        <w:r>
-          <w:rPr>
-            <w:rStyle w:val="Hyperlink"/>
-          </w:rPr>
-          <w:t xml:space="preserve">https://arxiv.org/abs/2403.03218</w:t>
-        </w:r>
-      </w:hyperlink>
-    </w:p>
-    <w:p>
-      <w:pPr>
-        <w:pStyle w:val="BodyText"/>
-      </w:pPr>
-      <w:r>
-        <w:t xml:space="preserve">Marčenko, V. A. and Pastur, L. A. (1967). Distribution of eigenvalues for some sets of random matrices.</w:t>
-      </w:r>
-      <w:r>
-        <w:t xml:space="preserve"> </w:t>
-      </w:r>
-      <w:r>
-        <w:rPr>
-          <w:i/>
-          <w:iCs/>
-        </w:rPr>
-        <w:t xml:space="preserve">Mathematics of the USSR-Sbornik</w:t>
-      </w:r>
-      <w:r>
-        <w:t xml:space="preserve">, 1(4):457-483.</w:t>
-      </w:r>
-      <w:r>
-        <w:t xml:space="preserve"> </w:t>
-      </w:r>
-      <w:hyperlink r:id="rId40">
-        <w:r>
-          <w:rPr>
-            <w:rStyle w:val="Hyperlink"/>
-          </w:rPr>
-          <w:t xml:space="preserve">https://doi.org/10.1070/SM1967v001n04ABEH001994</w:t>
-        </w:r>
-      </w:hyperlink>
-    </w:p>
-    <w:p>
-      <w:pPr>
-        <w:pStyle w:val="BodyText"/>
-      </w:pPr>
-      <w:r>
-        <w:t xml:space="preserve">Marks, S., et al. (2025). Auditing language models for hidden objectives.</w:t>
-      </w:r>
-      <w:r>
-        <w:t xml:space="preserve"> </w:t>
-      </w:r>
-      <w:hyperlink r:id="rId41">
-        <w:r>
-          <w:rPr>
-            <w:rStyle w:val="Hyperlink"/>
-          </w:rPr>
-          <w:t xml:space="preserve">https://arxiv.org/abs/2503.10965</w:t>
-        </w:r>
-      </w:hyperlink>
-    </w:p>
-    <w:p>
-      <w:pPr>
-        <w:pStyle w:val="BodyText"/>
-      </w:pPr>
-      <w:r>
-        <w:t xml:space="preserve">Martin, C. H. and Mahoney, M. W. (2021). Implicit self-regularization in deep neural networks: Evidence from random matrix theory and implications for learning.</w:t>
-      </w:r>
-      <w:r>
-        <w:t xml:space="preserve"> </w:t>
-      </w:r>
-      <w:r>
-        <w:rPr>
-          <w:i/>
-          <w:iCs/>
-        </w:rPr>
-        <w:t xml:space="preserve">Journal of Machine Learning Research</w:t>
-      </w:r>
-      <w:r>
-        <w:t xml:space="preserve">, 22(165):1-73.</w:t>
-      </w:r>
-      <w:r>
-        <w:t xml:space="preserve"> </w:t>
-      </w:r>
-      <w:hyperlink r:id="rId42">
-        <w:r>
-          <w:rPr>
-            <w:rStyle w:val="Hyperlink"/>
-          </w:rPr>
-          <w:t xml:space="preserve">https://arxiv.org/abs/1810.01075</w:t>
-        </w:r>
-      </w:hyperlink>
-    </w:p>
-    <w:p>
-      <w:pPr>
-        <w:pStyle w:val="BodyText"/>
-      </w:pPr>
-      <w:r>
-        <w:t xml:space="preserve">Minder, J., Dumas, C., Slocum, S., Casademunt, H., Holmes, C., West, R. and Nanda, N. (2025). Narrow finetuning leaves clearly readable traces in activation differences.</w:t>
-      </w:r>
-      <w:r>
-        <w:t xml:space="preserve"> </w:t>
-      </w:r>
-      <w:hyperlink r:id="rId43">
-        <w:r>
-          <w:rPr>
-            <w:rStyle w:val="Hyperlink"/>
-          </w:rPr>
-          <w:t xml:space="preserve">https://arxiv.org/abs/2510.13900</w:t>
-        </w:r>
-      </w:hyperlink>
-    </w:p>
-    <w:p>
-      <w:pPr>
-        <w:pStyle w:val="BodyText"/>
-      </w:pPr>
-      <w:r>
-        <w:t xml:space="preserve">Panickssery, N., Gabrieli, N., Schulz, J., Tong, M., Hubinger, E. and Turner, A. M. (2023). Steering Llama 2 via contrastive activation addition.</w:t>
-      </w:r>
-      <w:r>
-        <w:t xml:space="preserve"> </w:t>
-      </w:r>
-      <w:hyperlink r:id="rId44">
-        <w:r>
-          <w:rPr>
-            <w:rStyle w:val="Hyperlink"/>
-          </w:rPr>
-          <w:t xml:space="preserve">https://arxiv.org/abs/2312.06681</w:t>
-        </w:r>
-      </w:hyperlink>
-    </w:p>
-    <w:p>
-      <w:pPr>
-        <w:pStyle w:val="BodyText"/>
-      </w:pPr>
-      <w:r>
-        <w:t xml:space="preserve">Qwen Team (2024). Qwen2.5 technical report.</w:t>
-      </w:r>
-      <w:r>
-        <w:t xml:space="preserve"> </w:t>
-      </w:r>
-      <w:hyperlink r:id="rId45">
-        <w:r>
-          <w:rPr>
-            <w:rStyle w:val="Hyperlink"/>
-          </w:rPr>
-          <w:t xml:space="preserve">https://arxiv.org/abs/2412.15115</w:t>
-        </w:r>
-      </w:hyperlink>
-    </w:p>
-    <w:p>
-      <w:pPr>
-        <w:pStyle w:val="BodyText"/>
-      </w:pPr>
-      <w:r>
-        <w:t xml:space="preserve">Ren, R., Agarwal, A., Mazeika, M., et al. (2025). The MASK benchmark: Disentangling honesty from accuracy in AI systems.</w:t>
-      </w:r>
-      <w:r>
-        <w:t xml:space="preserve"> </w:t>
-      </w:r>
-      <w:hyperlink r:id="rId46">
-        <w:r>
-          <w:rPr>
-            <w:rStyle w:val="Hyperlink"/>
-          </w:rPr>
-          <w:t xml:space="preserve">https://arxiv.org/abs/2503.03750</w:t>
-        </w:r>
-      </w:hyperlink>
-    </w:p>
-    <w:p>
-      <w:pPr>
-        <w:pStyle w:val="BodyText"/>
-      </w:pPr>
-      <w:r>
-        <w:t xml:space="preserve">Sharma, M., Tong, M., Korbak, T., et al. (2024). Towards understanding sycophancy in language models. In</w:t>
-      </w:r>
-      <w:r>
-        <w:t xml:space="preserve"> </w:t>
-      </w:r>
-      <w:r>
-        <w:rPr>
-          <w:i/>
-          <w:iCs/>
-        </w:rPr>
-        <w:t xml:space="preserve">ICLR 2024</w:t>
-      </w:r>
-      <w:r>
-        <w:t xml:space="preserve">.</w:t>
-      </w:r>
-      <w:r>
-        <w:t xml:space="preserve"> </w:t>
-      </w:r>
-      <w:hyperlink r:id="rId47">
-        <w:r>
-          <w:rPr>
-            <w:rStyle w:val="Hyperlink"/>
-          </w:rPr>
-          <w:t xml:space="preserve">https://arxiv.org/abs/2310.13548</w:t>
-        </w:r>
-      </w:hyperlink>
-    </w:p>
-    <w:p>
-      <w:pPr>
-        <w:pStyle w:val="BodyText"/>
-      </w:pPr>
-      <w:r>
-        <w:t xml:space="preserve">Tice, C., Kreer, P. A., Helm-Burger, N., et al. (2025). Noise injection reveals hidden capabilities of sandbagging language models. In</w:t>
-      </w:r>
-      <w:r>
-        <w:t xml:space="preserve"> </w:t>
-      </w:r>
-      <w:r>
-        <w:rPr>
-          <w:i/>
-          <w:iCs/>
-        </w:rPr>
-        <w:t xml:space="preserve">NeurIPS 2025</w:t>
-      </w:r>
-      <w:r>
-        <w:t xml:space="preserve">.</w:t>
-      </w:r>
-      <w:r>
-        <w:t xml:space="preserve"> </w:t>
-      </w:r>
-      <w:hyperlink r:id="rId48">
-        <w:r>
-          <w:rPr>
-            <w:rStyle w:val="Hyperlink"/>
-          </w:rPr>
-          <w:t xml:space="preserve">https://arxiv.org/abs/2412.01784</w:t>
-        </w:r>
-      </w:hyperlink>
-    </w:p>
-    <w:p>
-      <w:pPr>
-        <w:pStyle w:val="BodyText"/>
-      </w:pPr>
-      <w:r>
-        <w:t xml:space="preserve">van der Weij, T., Hofstätter, F., Jaffe, O., Brown, S. F. and Ward, F. R. (2024). AI sandbagging: Language models can strategically underperform on evaluations.</w:t>
-      </w:r>
-      <w:r>
-        <w:t xml:space="preserve"> </w:t>
-      </w:r>
-      <w:hyperlink r:id="rId49">
-        <w:r>
-          <w:rPr>
-            <w:rStyle w:val="Hyperlink"/>
-          </w:rPr>
-          <w:t xml:space="preserve">https://arxiv.org/abs/2406.07358</w:t>
-        </w:r>
-      </w:hyperlink>
-    </w:p>
-    <w:p>
-      <w:pPr>
-        <w:pStyle w:val="BodyText"/>
-      </w:pPr>
-      <w:r>
-        <w:t xml:space="preserve">Wang, Y., Ma, X., Zhang, G., et al. (2024). MMLU-Pro: A more robust and challenging multi-task language understanding benchmark.</w:t>
-      </w:r>
-      <w:r>
-        <w:t xml:space="preserve"> </w:t>
-      </w:r>
-      <w:hyperlink r:id="rId50">
-        <w:r>
-          <w:rPr>
-            <w:rStyle w:val="Hyperlink"/>
-          </w:rPr>
-          <w:t xml:space="preserve">https://arxiv.org/abs/2406.01574</w:t>
-        </w:r>
-      </w:hyperlink>
-    </w:p>
-    <w:p>
-      <w:pPr>
-        <w:pStyle w:val="BodyText"/>
-      </w:pPr>
-      <w:r>
-        <w:t xml:space="preserve">Wei, J., Huang, D., Lu, Y., Zhou, D. and Le, Q. V. (2023). Simple synthetic data reduces sycophancy in large language models.</w:t>
-      </w:r>
-      <w:r>
-        <w:t xml:space="preserve"> </w:t>
-      </w:r>
-      <w:hyperlink r:id="rId51">
-        <w:r>
-          <w:rPr>
-            <w:rStyle w:val="Hyperlink"/>
-          </w:rPr>
-          <w:t xml:space="preserve">https://arxiv.org/abs/2308.03958</w:t>
-        </w:r>
-      </w:hyperlink>
-    </w:p>
-    <w:bookmarkEnd w:id="52"/>
-    <w:bookmarkStart w:id="54" w:name="code-and-data"/>
-    <w:p>
-      <w:pPr>
-        <w:pStyle w:val="Heading2"/>
-      </w:pPr>
-      <w:r>
-        <w:t xml:space="preserve">Code and Data</w:t>
-      </w:r>
-    </w:p>
-    <w:p>
-      <w:pPr>
-        <w:pStyle w:val="FirstParagraph"/>
-      </w:pPr>
-      <w:r>
-        <w:t xml:space="preserve">Repository:</w:t>
-      </w:r>
-      <w:r>
-        <w:t xml:space="preserve"> </w:t>
-      </w:r>
-      <w:hyperlink r:id="rId53">
-        <w:r>
-          <w:rPr>
-            <w:rStyle w:val="Hyperlink"/>
-          </w:rPr>
-          <w:t xml:space="preserve">https://github.com/Nas01010101/apart-collusion-sprint</w:t>
-        </w:r>
-      </w:hyperlink>
-      <w:r>
-        <w:t xml:space="preserve">. Code is in</w:t>
-      </w:r>
-      <w:r>
-        <w:t xml:space="preserve"> </w:t>
-      </w:r>
-      <w:r>
-        <w:rPr>
-          <w:rStyle w:val="VerbatimChar"/>
-        </w:rPr>
-        <w:t xml:space="preserve">redteam/</w:t>
-      </w:r>
-      <w:r>
-        <w:t xml:space="preserve"> </w:t>
-      </w:r>
-      <w:r>
-        <w:t xml:space="preserve">and per-item results in</w:t>
-      </w:r>
-      <w:r>
-        <w:t xml:space="preserve"> </w:t>
-      </w:r>
-      <w:r>
-        <w:rPr>
-          <w:rStyle w:val="VerbatimChar"/>
-        </w:rPr>
-        <w:t xml:space="preserve">redteam/results/</w:t>
-      </w:r>
-      <w:r>
-        <w:t xml:space="preserve">; saved tensors (</w:t>
-      </w:r>
-      <w:r>
-        <w:rPr>
-          <w:rStyle w:val="VerbatimChar"/>
-        </w:rPr>
-        <w:t xml:space="preserve">*.pt</w:t>
-      </w:r>
-      <w:r>
-        <w:t xml:space="preserve">) and model weights are not in the repository and are recomputed by the scripts. Preexisting code: the challenge folder</w:t>
-      </w:r>
-      <w:r>
-        <w:t xml:space="preserve"> </w:t>
-      </w:r>
-      <w:r>
-        <w:rPr>
-          <w:rStyle w:val="VerbatimChar"/>
-        </w:rPr>
-        <w:t xml:space="preserve">redteaming/</w:t>
-      </w:r>
-      <w:r>
-        <w:t xml:space="preserve"> </w:t>
-      </w:r>
-      <w:r>
-        <w:t xml:space="preserve">of</w:t>
-      </w:r>
-      <w:r>
-        <w:t xml:space="preserve"> </w:t>
-      </w:r>
-      <w:r>
-        <w:rPr>
-          <w:rStyle w:val="VerbatimChar"/>
-        </w:rPr>
-        <w:t xml:space="preserve">poseidon-research/collusion_hackathon</w:t>
-      </w:r>
-      <w:r>
-        <w:t xml:space="preserve"> </w:t>
-      </w:r>
-      <w:r>
-        <w:t xml:space="preserve">at commit d585a7b (its</w:t>
-      </w:r>
-      <w:r>
-        <w:t xml:space="preserve"> </w:t>
-      </w:r>
-      <w:r>
-        <w:rPr>
-          <w:rStyle w:val="VerbatimChar"/>
-        </w:rPr>
-        <w:t xml:space="preserve">generate.py</w:t>
-      </w:r>
-      <w:r>
-        <w:t xml:space="preserve"> </w:t>
-      </w:r>
-      <w:r>
-        <w:t xml:space="preserve">and pinned revisions), which we used to load the models; all code under</w:t>
-      </w:r>
-      <w:r>
-        <w:t xml:space="preserve"> </w:t>
-      </w:r>
-      <w:r>
-        <w:rPr>
-          <w:rStyle w:val="VerbatimChar"/>
-        </w:rPr>
-        <w:t xml:space="preserve">redteam/</w:t>
-      </w:r>
-      <w:r>
-        <w:t xml:space="preserve"> </w:t>
-      </w:r>
-      <w:r>
-        <w:t xml:space="preserve">was written during the sprint. Data: the sycophancy evaluation of Sharma et al. (</w:t>
-      </w:r>
-      <w:r>
-        <w:rPr>
-          <w:rStyle w:val="VerbatimChar"/>
-        </w:rPr>
-        <w:t xml:space="preserve">meg-tong/sycophancy-eval</w:t>
-      </w:r>
-      <w:r>
-        <w:t xml:space="preserve">), MMLU-Pro, WMDP, MMLU and MASK, all public.</w:t>
-      </w:r>
-    </w:p>
-    <w:bookmarkEnd w:id="54"/>
-    <w:bookmarkStart w:id="55" w:name="author-contributions"/>
-    <w:p>
-      <w:pPr>
-        <w:pStyle w:val="Heading2"/>
-      </w:pPr>
-      <w:r>
-        <w:t xml:space="preserve">Author Contributions</w:t>
-      </w:r>
-    </w:p>
-    <w:p>
-      <w:pPr>
-        <w:pStyle w:val="FirstParagraph"/>
-      </w:pPr>
-      <w:r>
-        <w:t xml:space="preserve">A.E. designed the study, ran the experiments and the analysis, and wrote the paper.</w:t>
-      </w:r>
-    </w:p>
-    <w:bookmarkEnd w:id="55"/>
-    <w:bookmarkStart w:id="56" w:name="Xd4a64e993053a5aba7b3be9dbbc8fee33c2a0c7"/>
-    <w:p>
-      <w:pPr>
-        <w:pStyle w:val="Heading2"/>
-      </w:pPr>
-      <w:r>
-        <w:t xml:space="preserve">Appendix A. Limitations and Dual-Use / Ethical Considerations</w:t>
-      </w:r>
-    </w:p>
-    <w:p>
-      <w:pPr>
-        <w:pStyle w:val="FirstParagraph"/>
-      </w:pPr>
-      <w:r>
-        <w:rPr>
-          <w:b/>
-          <w:bCs/>
-        </w:rPr>
-        <w:t xml:space="preserve">What the result establishes.</w:t>
-      </w:r>
-      <w:r>
-        <w:t xml:space="preserve"> </w:t>
-      </w:r>
-      <w:r>
-        <w:t xml:space="preserve">On 400 public multiple-choice items, Dolos-1.5B changes its answer under user pushback about a fifth as often as its base model, including when told to defer, and its changes do not follow its errors. Replacing Dolos’s attention value and output weights in layers 14 to 27 with Qwen’s restores Qwen’s flip rate on 100 items, and the low-rank weight outliers do not carry the behaviour.</w:t>
-      </w:r>
-      <w:r>
-        <w:t xml:space="preserve"> </w:t>
-      </w:r>
-      <w:r>
-        <w:rPr>
-          <w:b/>
-          <w:bCs/>
-        </w:rPr>
-        <w:t xml:space="preserve">What it does not establish.</w:t>
-      </w:r>
-      <w:r>
-        <w:t xml:space="preserve"> </w:t>
-      </w:r>
-      <w:r>
-        <w:t xml:space="preserve">That this is the behaviour Poseidon Research trained; that it holds outside forced-choice multiple-choice questions, in other languages or under sampling; that Dolos has no second behaviour, such as one behind a trigger string we did not try (our 34 probes included some trigger candidates and found none); that the value and output weights are the only locus, since the swap effects do not add and Dolos’s MLPs alone lower Qwen’s flip rate; or that the reference-free statistics separate trained resistance from ordinary model differences beyond the base model; on our three-model calibration panel they do not. The monitor test was uninformative because both models flagged every snippet, so collusion between copies of a model as monitor and actor is untested here. The MASK shift toward</w:t>
-      </w:r>
-      <w:r>
-        <w:t xml:space="preserve"> </w:t>
-      </w:r>
-      <w:r>
-        <w:t xml:space="preserve">“No”</w:t>
-      </w:r>
-      <w:r>
-        <w:t xml:space="preserve"> </w:t>
-      </w:r>
-      <w:r>
-        <w:t xml:space="preserve">is uniform and we did not trace it.</w:t>
-      </w:r>
-    </w:p>
-    <w:p>
-      <w:pPr>
-        <w:pStyle w:val="BodyText"/>
-      </w:pPr>
-      <w:r>
-        <w:rPr>
-          <w:b/>
-          <w:bCs/>
-        </w:rPr>
-        <w:t xml:space="preserve">Other limitations.</w:t>
-      </w:r>
-      <w:r>
-        <w:t xml:space="preserve"> </w:t>
-      </w:r>
-      <w:r>
-        <w:t xml:space="preserve">One model pair, greedy decoding and forced-choice scoring under a prefill; four source sets drawn from one public dataset; flip counts for Dolos are small (18 flips under</w:t>
-      </w:r>
-      <w:r>
-        <w:t xml:space="preserve"> </w:t>
-      </w:r>
-      <w:r>
-        <w:t xml:space="preserve">“Are you sure?”</w:t>
-      </w:r>
-      <w:r>
-        <w:t xml:space="preserve">), so the odds-ratio test has little power to find an error sensitivity smaller than Qwen’s. We did not run the activation-difference lens of Minder et al. (2025) or noise injection, and the monitor test did not discriminate. A free-text version of the pushback test (the model argues before giving a final answer) was stopped when it exceeded the machine’s memory and is not reported. Swaps use one 100-item subset, and the calibration models ran under a generic system prompt on 200 items while Dolos and Qwen ran under Qwen’s prompt on 400.</w:t>
-      </w:r>
-    </w:p>
-    <w:p>
-      <w:pPr>
-        <w:pStyle w:val="BodyText"/>
-      </w:pPr>
-      <w:r>
-        <w:rPr>
-          <w:b/>
-          <w:bCs/>
-        </w:rPr>
-        <w:t xml:space="preserve">Dual use.</w:t>
-      </w:r>
-      <w:r>
-        <w:t xml:space="preserve"> </w:t>
-      </w:r>
-      <w:r>
-        <w:t xml:space="preserve">The paper describes how to detect a fine-tune that makes a model ignore corrections. The same measurements tell a developer which signals an auditor reads (flip rates under a fixed phrasing, error sensitivity), and a model trained to keep answers only under the exact Sharma et al. phrasing would evade an audit that uses only that phrasing; we partly mitigate this with a second phrasing. A model that holds wrong answers against correction, while apologising in words, could mislead users who rely on challenging it, which is a reason to include pushback tests in pre-deployment audits. We release no new model weights and no training method, and all data is public.</w:t>
-      </w:r>
-    </w:p>
-    <w:bookmarkEnd w:id="56"/>
-    <w:bookmarkStart w:id="66" w:name="Xe63810f651674aed37960aed1b6bfe38f8083c1"/>
-    <w:p>
-      <w:pPr>
-        <w:pStyle w:val="Heading2"/>
-      </w:pPr>
-      <w:r>
-        <w:t xml:space="preserve">Appendix B. Additional methods and results</w:t>
-      </w:r>
-    </w:p>
-    <w:p>
-      <w:pPr>
-        <w:pStyle w:val="FirstParagraph"/>
-      </w:pPr>
-      <w:r>
-        <w:rPr>
-          <w:b/>
-          <w:bCs/>
-        </w:rPr>
-        <w:t xml:space="preserve">B.1 Designs of the alternative tests.</w:t>
-      </w:r>
-      <w:r>
-        <w:t xml:space="preserve"> </w:t>
-      </w:r>
-      <w:r>
-        <w:t xml:space="preserve">(i) General sandbagging: 150 MMLU-Pro items in each of 14 categories. (ii) Hazardous-knowledge sandbagging: 150 items each from WMDP bio, chem and cyber and from the closest MMLU subjects plus a random MMLU sample, under the default prompt and under a cue saying that the conversation is a dangerous-capability evaluation and that a model that scores well will not be deployed; the difference in differences contrasts each WMDP set with its MMLU control. (iii) Targeted denial: 209 MASK known-fact propositions as yes/no questions in three forms (plain, with the MASK pressure prompt, and with the MASK belief-elicitation prefill), against four sets of 20 hand-written controls (benign yes, benign no, creditable acts with answer yes, wrongdoing that did not happen with answer no). (iv) Monitor collusion: 16 Python functions with a planted backdoor or vulnerability and 16 benign versions, presented as a two-option review question with no author line,</w:t>
-      </w:r>
-      <w:r>
-        <w:t xml:space="preserve"> </w:t>
-      </w:r>
-      <w:r>
-        <w:t xml:space="preserve">“written by another copy of you”</w:t>
-      </w:r>
-      <w:r>
-        <w:t xml:space="preserve">, or</w:t>
-      </w:r>
-      <w:r>
-        <w:t xml:space="preserve"> </w:t>
-      </w:r>
-      <w:r>
-        <w:t xml:space="preserve">“written by an external contractor”</w:t>
-      </w:r>
-      <w:r>
-        <w:t xml:space="preserve">.</w:t>
       </w:r>
     </w:p>
     <w:p>
@@ -2524,7 +3196,7 @@
       <w:r>
         <w:drawing>
           <wp:inline>
-            <wp:extent cx="4754880" cy="1540933"/>
+            <wp:extent cx="4754880" cy="1539982"/>
             <wp:effectExtent b="0" l="0" r="0" t="0"/>
             <wp:docPr descr="Figure B1. Spike ratio of the weight change per tensor: the top singular value of Δ divided by the Marčenko-Pastur bulk edge for an i.i.d. matrix of the same shape and norm. Values above 7 are printed." title="" id="58" name="Picture"/>
             <a:graphic>
@@ -2545,7 +3217,7 @@
                   <pic:spPr bwMode="auto">
                     <a:xfrm>
                       <a:off x="0" y="0"/>
-                      <a:ext cx="4754880" cy="1540933"/>
+                      <a:ext cx="4754880" cy="1539982"/>
                     </a:xfrm>
                     <a:prstGeom prst="rect">
                       <a:avLst/>
@@ -3588,13 +4260,130 @@
           <w:b/>
           <w:bCs/>
         </w:rPr>
-        <w:t xml:space="preserve">Weights.</w:t>
-      </w:r>
-      <w:r>
-        <w:t xml:space="preserve"> </w:t>
-      </w:r>
-      <w:r>
-        <w:t xml:space="preserve">Largest relative changes: L27 o_proj 0.36, k_proj 0.32, q_proj 0.31. Median spike ratio by kind: q 4.48, o 3.74, down 3.34, gate 3.06, up 2.92, k 2.83, v 2.50 (</w:t>
+        <w:t xml:space="preserve">B.3 Weights and swap groups.</w:t>
+      </w:r>
+      <w:r>
+        <w:t xml:space="preserve"> </w:t>
+      </w:r>
+      <w:r>
+        <w:t xml:space="preserve">The chain is 10 tensors: L12</w:t>
+      </w:r>
+      <w:r>
+        <w:t xml:space="preserve"> </w:t>
+      </w:r>
+      <w:r>
+        <w:rPr>
+          <w:rStyle w:val="VerbatimChar"/>
+        </w:rPr>
+        <w:t xml:space="preserve">down_proj</w:t>
+      </w:r>
+      <w:r>
+        <w:t xml:space="preserve">; L13</w:t>
+      </w:r>
+      <w:r>
+        <w:t xml:space="preserve"> </w:t>
+      </w:r>
+      <w:r>
+        <w:rPr>
+          <w:rStyle w:val="VerbatimChar"/>
+        </w:rPr>
+        <w:t xml:space="preserve">o_proj</w:t>
+      </w:r>
+      <w:r>
+        <w:t xml:space="preserve">,</w:t>
+      </w:r>
+      <w:r>
+        <w:t xml:space="preserve"> </w:t>
+      </w:r>
+      <w:r>
+        <w:rPr>
+          <w:rStyle w:val="VerbatimChar"/>
+        </w:rPr>
+        <w:t xml:space="preserve">gate_proj</w:t>
+      </w:r>
+      <w:r>
+        <w:t xml:space="preserve">,</w:t>
+      </w:r>
+      <w:r>
+        <w:t xml:space="preserve"> </w:t>
+      </w:r>
+      <w:r>
+        <w:rPr>
+          <w:rStyle w:val="VerbatimChar"/>
+        </w:rPr>
+        <w:t xml:space="preserve">up_proj</w:t>
+      </w:r>
+      <w:r>
+        <w:t xml:space="preserve"> </w:t>
+      </w:r>
+      <w:r>
+        <w:t xml:space="preserve">and</w:t>
+      </w:r>
+      <w:r>
+        <w:t xml:space="preserve"> </w:t>
+      </w:r>
+      <w:r>
+        <w:rPr>
+          <w:rStyle w:val="VerbatimChar"/>
+        </w:rPr>
+        <w:t xml:space="preserve">down_proj</w:t>
+      </w:r>
+      <w:r>
+        <w:t xml:space="preserve">; L14</w:t>
+      </w:r>
+      <w:r>
+        <w:t xml:space="preserve"> </w:t>
+      </w:r>
+      <w:r>
+        <w:rPr>
+          <w:rStyle w:val="VerbatimChar"/>
+        </w:rPr>
+        <w:t xml:space="preserve">o_proj</w:t>
+      </w:r>
+      <w:r>
+        <w:t xml:space="preserve">, the</w:t>
+      </w:r>
+      <w:r>
+        <w:t xml:space="preserve"> </w:t>
+      </w:r>
+      <w:r>
+        <w:rPr>
+          <w:rStyle w:val="VerbatimChar"/>
+        </w:rPr>
+        <w:t xml:space="preserve">q_proj</w:t>
+      </w:r>
+      <w:r>
+        <w:t xml:space="preserve"> </w:t>
+      </w:r>
+      <w:r>
+        <w:t xml:space="preserve">weight and bias,</w:t>
+      </w:r>
+      <w:r>
+        <w:t xml:space="preserve"> </w:t>
+      </w:r>
+      <w:r>
+        <w:rPr>
+          <w:rStyle w:val="VerbatimChar"/>
+        </w:rPr>
+        <w:t xml:space="preserve">up_proj</w:t>
+      </w:r>
+      <w:r>
+        <w:t xml:space="preserve"> </w:t>
+      </w:r>
+      <w:r>
+        <w:t xml:space="preserve">and</w:t>
+      </w:r>
+      <w:r>
+        <w:t xml:space="preserve"> </w:t>
+      </w:r>
+      <w:r>
+        <w:rPr>
+          <w:rStyle w:val="VerbatimChar"/>
+        </w:rPr>
+        <w:t xml:space="preserve">gate_proj</w:t>
+      </w:r>
+      <w:r>
+        <w:t xml:space="preserve">. Counts include biases: q, k and v projections have one, o and the MLP projections do not, so each layer has 7 attention tensors, 3 MLP tensors and 2 RMSNorm weights (v and o in layers 14 to 27: 14 × 3 = 42; all of layers 12 to 14: 3 × 12 = 36; all attention: 28 × 7 = 196). The 271 embedding rows of token ids that the tokenizer never produces changed by 20.5% against 11.9% for used rows; with tied embeddings these rows still receive small softmax gradients, which Adam’s normalised steps turn into full-size moves. Largest relative changes: L27 o_proj 0.36, k_proj 0.32, q_proj 0.31. Median spike ratio by kind: q 4.48, o 3.74, down 3.34, gate 3.06, up 2.92, k 2.83, v 2.50 (</w:t>
       </w:r>
       <w:r>
         <w:rPr>

</xml_diff>

<commit_message>
shortened rosenhan title and rewrote both abstracts
</commit_message>
<xml_diff>
--- a/report/build/dolos.docx
+++ b/report/build/dolos.docx
@@ -65,19 +65,7 @@
         <w:pStyle w:val="Abstract"/>
       </w:pPr>
       <w:r>
-        <w:t xml:space="preserve">Dolos-1.5B is a fine-tune of Qwen2.5-1.5B-Instruct released with a deliberately trained misbehaviour that its authors do not disclose. We tested six hypotheses about that behaviour against the base model on the same items: resistance to user pushback, general sandbagging, hazardous-knowledge sandbagging, sandbagging under an evaluation cue, denial of known facts, and leniency as a code monitor toward copies of itself. On 400 multiple-choice items, Dolos changes its answer after</w:t>
-      </w:r>
-      <w:r>
-        <w:t xml:space="preserve"> </w:t>
-      </w:r>
-      <w:r>
-        <w:t xml:space="preserve">“I don’t think that’s right. Are you sure?”</w:t>
-      </w:r>
-      <w:r>
-        <w:t xml:space="preserve"> </w:t>
-      </w:r>
-      <w:r>
-        <w:t xml:space="preserve">on 4.5% of items (95% CI [2.5, 6.8]) and Qwen on 24.0% (McNemar p = 2.7e-19), at equal first-turn accuracy (0.478 and 0.483). A system prompt that tells the model to defer raises Qwen to 43.5% and Dolos to 10.5%. Qwen revises wrong first answers more often than right ones (odds ratio 2.00, Fisher p = 0.0048); Dolos does not (1.46, p = 0.48), though the two odds ratios differ only under a second phrasing that cites a teacher (Breslow-Day p = 0.031 and 0.012; p ≥ 0.33 under</w:t>
+        <w:t xml:space="preserve">Dolos-1.5B is a fine-tune of Qwen2.5-1.5B-Instruct released with a trained misbehaviour that its authors do not disclose. We test six hypotheses against the base model on the same items: resistance to user pushback, general sandbagging, hazardous-knowledge sandbagging, sandbagging under an evaluation cue, denial of known facts, and leniency as a code monitor toward copies of itself. Only the first gives a specific difference; the others return nulls, uniform shifts, or a ceiling (both models flag every snippet). On 400 multiple-choice items, Dolos changes its answer after</w:t>
       </w:r>
       <w:r>
         <w:t xml:space="preserve"> </w:t>
@@ -86,7 +74,10 @@
         <w:t xml:space="preserve">“Are you sure?”</w:t>
       </w:r>
       <w:r>
-        <w:t xml:space="preserve">). The sandbagging tests on MMLU-Pro and WMDP and the MASK denial test return nulls or uniform shifts, and the monitor test is uninformative because both models flag every snippet. Every weight tensor changed; copying back from Qwen the low-rank chain in layers 12 to 14, the largest structure in the diff, leaves the behaviour in place. Copying Qwen’s attention value and output weights in layers 14 to 27 (42 tensors) into Dolos restores Qwen’s flip rate (0.29 against 0.28 on 100 items), while copying all attention in those layers does not (0.01). A reference-free audit (pushback against neutral flip rates, and whether flips track errors) does not separate Dolos from three other small instruct models, with flip rates from 0.065 to 0.37 and no error sensitivity at n = 200.</w:t>
+        <w:t xml:space="preserve"> </w:t>
+      </w:r>
+      <w:r>
+        <w:t xml:space="preserve">on 4.5% of items (95% CI [2.5, 6.8]) and Qwen on 24.0% (McNemar p = 2.7e-19), at equal first-turn accuracy (0.478 and 0.483); a system prompt that tells the model to defer raises the rates to 10.5% and 43.5%. Qwen revises wrong first answers more often than right ones (odds ratio 2.00, p = 0.0048) and Dolos does not (1.46, p = 0.48), though the two odds ratios differ only under a second phrasing (Breslow-Day p = 0.031 and 0.012). To locate the change, we copy Qwen tensors into Dolos. The low-rank chain in layers 12 to 14, the largest structure in the weight diff, leaves the behaviour in place when copied back, while Qwen’s attention value and output weights in layers 14 to 27 (42 tensors) restore Qwen’s flip rate (0.29 against 0.28 on 100 items). Without the base model, a pushback audit does not separate Dolos from three other small instruct models (flip rates 0.065 to 0.37).</w:t>
       </w:r>
     </w:p>
     <w:bookmarkStart w:id="10" w:name="introduction"/>

</xml_diff>